<commit_message>
Updated Resume - michaelpragsdale.com
</commit_message>
<xml_diff>
--- a/portfolio/documents/resume/mragsdale-resume.docx
+++ b/portfolio/documents/resume/mragsdale-resume.docx
@@ -438,7 +438,13 @@
         <w:t>Operational Leadership:</w:t>
       </w:r>
       <w:r>
-        <w:t xml:space="preserve"> Function as the primary escalation point for resolving complex facility logistical conflicts and overseeing high-volume financial reconciliation, making independent technical and policy-aligned decisions.</w:t>
+        <w:t xml:space="preserve"> </w:t>
+      </w:r>
+      <w:r>
+        <w:t>Function as the primary escalation point for resolving complex facility logistical conflicts and overseeing high-volume Revenue Cycle Management (RCM) and financial reconciliation, making independent technical and policy-aligned decisions</w:t>
+      </w:r>
+      <w:r>
+        <w:t>.</w:t>
       </w:r>
     </w:p>
     <w:p>

</xml_diff>

<commit_message>
Adding LLM to michaelpragsdale.com
</commit_message>
<xml_diff>
--- a/portfolio/documents/resume/mragsdale-resume.docx
+++ b/portfolio/documents/resume/mragsdale-resume.docx
@@ -12,16 +12,40 @@
     </w:p>
     <w:p>
       <w:r>
-        <w:rPr>
-          <w:b/>
-          <w:bCs/>
-        </w:rPr>
-        <w:t>Systems Architect | Full-Stack Developer | Accessibility Specialist</w:t>
-      </w:r>
-      <w:r>
-        <w:t xml:space="preserve"> Norfolk, VA (Open to W2 roles within Virginia) hireme@michaelpragsdale.com | michaelpragsdale.com | </w:t>
-      </w:r>
-      <w:hyperlink r:id="rId5" w:tgtFrame="_blank" w:history="1">
+        <w:t>Systems Architect | Enterprise Data Engineer Norfolk, VA (Willing to relocate to the City of Charlottesville or Albemarle County)</w:t>
+      </w:r>
+      <w:r>
+        <w:t xml:space="preserve"> | </w:t>
+      </w:r>
+      <w:r>
+        <w:t xml:space="preserve">757-289-1609 | </w:t>
+      </w:r>
+      <w:hyperlink r:id="rId5" w:history="1">
+        <w:r>
+          <w:rPr>
+            <w:rStyle w:val="Hyperlink"/>
+          </w:rPr>
+          <w:t>hireme@michaelpragsdale.com</w:t>
+        </w:r>
+      </w:hyperlink>
+      <w:r>
+        <w:t xml:space="preserve"> </w:t>
+      </w:r>
+      <w:r>
+        <w:t xml:space="preserve">| </w:t>
+      </w:r>
+      <w:hyperlink r:id="rId6" w:history="1">
+        <w:r>
+          <w:rPr>
+            <w:rStyle w:val="Hyperlink"/>
+          </w:rPr>
+          <w:t>michaelpragsdale.com</w:t>
+        </w:r>
+      </w:hyperlink>
+      <w:r>
+        <w:t xml:space="preserve"> | </w:t>
+      </w:r>
+      <w:hyperlink r:id="rId7" w:tgtFrame="_blank" w:history="1">
         <w:r>
           <w:rPr>
             <w:rStyle w:val="Hyperlink"/>
@@ -48,23 +72,7 @@
     </w:p>
     <w:p>
       <w:r>
-        <w:t xml:space="preserve">Systems Architect and Full-Stack Developer driven by a philosophy of "Empathetic </w:t>
-      </w:r>
-      <w:proofErr w:type="gramStart"/>
-      <w:r>
-        <w:t>Engineering"—</w:t>
-      </w:r>
-      <w:proofErr w:type="gramEnd"/>
-      <w:r>
-        <w:t xml:space="preserve">the conviction that resilient software must respect both the server's infrastructure and the user's cognitive load. Specializing in bridging the gap between legacy databases and modern, high-performance cloud environments through custom PHP MVC frameworks, Vanilla JavaScript SPA routers, and strict WCAG 2.1 AA compliance. Proven expertise in </w:t>
-      </w:r>
-      <w:proofErr w:type="gramStart"/>
-      <w:r>
-        <w:t>engineering legally resilient</w:t>
-      </w:r>
-      <w:proofErr w:type="gramEnd"/>
-      <w:r>
-        <w:t>, Section 508 compliant digital infrastructure for enterprise, municipal, and multimedia ecosystems.</w:t>
+        <w:t>Systems Architect and Data Engineering Leader driven by a philosophy of "Empathetic Engineering"—the conviction that resilient data platforms must respect both the server's infrastructure and the end user’s cognitive load. Proven track record operating as a technical "player-coach," designing complex ETL pipelines, bridging legacy databases with modern cloud environments, and establishing strict enterprise compliance frameworks. Specialist in leveraging open-source MVC architecture, secure cloud deployments, and production-grade AI/LLM integrations to drive institutional data strategies and accessible, zero-latency digital ecosystems.</w:t>
       </w:r>
     </w:p>
     <w:p>
@@ -79,7 +87,25 @@
       <w:pPr>
         <w:numPr>
           <w:ilvl w:val="0"/>
-          <w:numId w:val="7"/>
+          <w:numId w:val="1"/>
+        </w:numPr>
+      </w:pPr>
+      <w:r>
+        <w:rPr>
+          <w:b/>
+          <w:bCs/>
+        </w:rPr>
+        <w:t>Data Architecture &amp; AI:</w:t>
+      </w:r>
+      <w:r>
+        <w:t xml:space="preserve"> ETL / ELT Pipelines, Production LLM/AI Integration (Gemini), Relational &amp; JSON Data Structures, Custom Open-Source MVC Frameworks</w:t>
+      </w:r>
+    </w:p>
+    <w:p>
+      <w:pPr>
+        <w:numPr>
+          <w:ilvl w:val="0"/>
+          <w:numId w:val="1"/>
         </w:numPr>
       </w:pPr>
       <w:r>
@@ -90,14 +116,14 @@
         <w:t>Languages &amp; Scripting:</w:t>
       </w:r>
       <w:r>
-        <w:t xml:space="preserve"> PHP 8.4, JavaScript (ES6+), Bash / Shell, Python, HTML5, CSS3/SCSS</w:t>
+        <w:t xml:space="preserve"> Python, PHP 8.4, SQL, JavaScript (ES6+), Bash / Shell, HTML5, CSS3/SCSS</w:t>
       </w:r>
     </w:p>
     <w:p>
       <w:pPr>
         <w:numPr>
           <w:ilvl w:val="0"/>
-          <w:numId w:val="7"/>
+          <w:numId w:val="1"/>
         </w:numPr>
       </w:pPr>
       <w:r>
@@ -116,22 +142,14 @@
       </w:r>
       <w:proofErr w:type="spellEnd"/>
       <w:r>
-        <w:t xml:space="preserve"> (Droplets/Spaces), Nginx, Cloudflare (DNS/SSL), </w:t>
-      </w:r>
-      <w:proofErr w:type="spellStart"/>
-      <w:r>
-        <w:t>Certbot</w:t>
-      </w:r>
-      <w:proofErr w:type="spellEnd"/>
-      <w:r>
-        <w:t>, Linux (Ubuntu/Debian)</w:t>
+        <w:t xml:space="preserve"> (Droplets/Spaces), Nginx, Cloudflare Zero Trust (DNS/SSL), Decoupled CI/CD Pipelines</w:t>
       </w:r>
     </w:p>
     <w:p>
       <w:pPr>
         <w:numPr>
           <w:ilvl w:val="0"/>
-          <w:numId w:val="7"/>
+          <w:numId w:val="1"/>
         </w:numPr>
       </w:pPr>
       <w:r>
@@ -139,82 +157,78 @@
           <w:b/>
           <w:bCs/>
         </w:rPr>
-        <w:t>Architecture &amp; Automation:</w:t>
-      </w:r>
-      <w:r>
-        <w:t xml:space="preserve"> Custom MVC Frameworks, Vanilla JS SPAs, </w:t>
+        <w:t>Compliance &amp; Enterprise Governance:</w:t>
+      </w:r>
+      <w:r>
+        <w:t xml:space="preserve"> Strict WCAG 2.1 AA, Section 508, </w:t>
       </w:r>
       <w:proofErr w:type="spellStart"/>
       <w:r>
-        <w:t>FFmpeg</w:t>
+        <w:t>ActiveNet</w:t>
       </w:r>
       <w:proofErr w:type="spellEnd"/>
       <w:r>
-        <w:t xml:space="preserve"> Automation, Decoupled CI/CD Pipelines</w:t>
-      </w:r>
-    </w:p>
-    <w:p>
-      <w:pPr>
-        <w:numPr>
-          <w:ilvl w:val="0"/>
-          <w:numId w:val="7"/>
-        </w:numPr>
+        <w:t xml:space="preserve"> CRM, JSON-LD / Schema.org, Deque axe</w:t>
+      </w:r>
+    </w:p>
+    <w:p>
+      <w:pPr>
+        <w:pStyle w:val="Heading1"/>
+      </w:pPr>
+      <w:r>
+        <w:t>RELEVANT TECHNICAL EXPERIENCE</w:t>
+      </w:r>
+    </w:p>
+    <w:p>
+      <w:pPr>
+        <w:pStyle w:val="Heading2"/>
       </w:pPr>
       <w:r>
         <w:rPr>
           <w:b/>
           <w:bCs/>
         </w:rPr>
-        <w:t>Compliance &amp; Enterprise:</w:t>
-      </w:r>
-      <w:r>
-        <w:t xml:space="preserve"> Strict WCAG 2.1 AA, Section 508, Deque axe, </w:t>
+        <w:t>Principal Systems Architect (Open Source)</w:t>
+      </w:r>
+      <w:r>
+        <w:t xml:space="preserve"> </w:t>
       </w:r>
       <w:proofErr w:type="spellStart"/>
       <w:r>
-        <w:t>ActiveNet</w:t>
+        <w:t>RaggieSoft</w:t>
       </w:r>
       <w:proofErr w:type="spellEnd"/>
       <w:r>
-        <w:t xml:space="preserve"> CRM, JSON-LD / Schema.org</w:t>
-      </w:r>
-    </w:p>
-    <w:p>
-      <w:pPr>
-        <w:pStyle w:val="Heading1"/>
-      </w:pPr>
-      <w:r>
-        <w:t>RELEVANT TECHNICAL EXPERIENCE</w:t>
-      </w:r>
-    </w:p>
-    <w:p>
-      <w:pPr>
-        <w:pStyle w:val="Heading2"/>
+        <w:t xml:space="preserve"> Media | Norfolk, VA | Est. 2008 – Present</w:t>
+      </w:r>
+    </w:p>
+    <w:p>
+      <w:pPr>
+        <w:numPr>
+          <w:ilvl w:val="0"/>
+          <w:numId w:val="2"/>
+        </w:numPr>
       </w:pPr>
       <w:r>
         <w:rPr>
           <w:b/>
           <w:bCs/>
         </w:rPr>
-        <w:t>Founder &amp; Systems Architect</w:t>
-      </w:r>
-      <w:r>
-        <w:t xml:space="preserve"> </w:t>
-      </w:r>
-      <w:proofErr w:type="spellStart"/>
-      <w:r>
-        <w:t>RaggieSoft</w:t>
-      </w:r>
-      <w:proofErr w:type="spellEnd"/>
-      <w:r>
-        <w:t xml:space="preserve"> Media | Norfolk, VA | Est. 2008 – Present</w:t>
+        <w:t>Systems Architecture &amp; Data Strategy:</w:t>
+      </w:r>
+      <w:r>
+        <w:t xml:space="preserve"> Engineered and open-sourced the Stardust Engine CMS (MIT License), defining the long-term architectural roadmap for a </w:t>
+      </w:r>
+      <w:r>
+        <w:lastRenderedPageBreak/>
+        <w:t>custom PHP 8.4 MVC framework that serves massive-scale narrative data via a zero-latency file-based JSON architecture.</w:t>
       </w:r>
     </w:p>
     <w:p>
       <w:pPr>
         <w:numPr>
           <w:ilvl w:val="0"/>
-          <w:numId w:val="8"/>
+          <w:numId w:val="2"/>
         </w:numPr>
       </w:pPr>
       <w:r>
@@ -222,38 +236,43 @@
           <w:b/>
           <w:bCs/>
         </w:rPr>
-        <w:t>Systems Architecture (Open Source):</w:t>
-      </w:r>
-      <w:r>
-        <w:t xml:space="preserve"> </w:t>
-      </w:r>
-      <w:r>
-        <w:t xml:space="preserve">Engineered and open-sourced </w:t>
-      </w:r>
+        <w:t>AI &amp; LLM Integration:</w:t>
+      </w:r>
+      <w:r>
+        <w:t xml:space="preserve"> Designed native API pipelines integrating advanced LLMs (Gemini) into the platform for automated data structuring, metadata generation, and narrative serialization within a governed digital framework.</w:t>
+      </w:r>
+    </w:p>
+    <w:p>
+      <w:pPr>
+        <w:numPr>
+          <w:ilvl w:val="0"/>
+          <w:numId w:val="2"/>
+        </w:numPr>
+      </w:pPr>
       <w:r>
         <w:rPr>
           <w:b/>
           <w:bCs/>
         </w:rPr>
-        <w:t>Stardust Engine CMS</w:t>
-      </w:r>
-      <w:r>
-        <w:t xml:space="preserve"> (MIT License), a custom-built PHP 8.4 MVC framework utilizing a file-based JSON architecture to serve massive-scale narrative multimedia while </w:t>
-      </w:r>
-      <w:proofErr w:type="gramStart"/>
-      <w:r>
-        <w:t>entirely eliminating</w:t>
-      </w:r>
-      <w:proofErr w:type="gramEnd"/>
-      <w:r>
-        <w:t xml:space="preserve"> database latency.</w:t>
+        <w:t>DevOps &amp; Cloud Leadership:</w:t>
+      </w:r>
+      <w:r>
+        <w:t xml:space="preserve"> Directed a strategic infrastructure migration to high-performance </w:t>
+      </w:r>
+      <w:proofErr w:type="spellStart"/>
+      <w:r>
+        <w:t>DigitalOcean</w:t>
+      </w:r>
+      <w:proofErr w:type="spellEnd"/>
+      <w:r>
+        <w:t xml:space="preserve"> environments, utilizing Cloudflare edge networking, custom Nginx proxies, and decoupled Bash CI/CD pipelines (Jenna and Sarah) for automated, zero-downtime server synchronization.</w:t>
       </w:r>
     </w:p>
     <w:p>
       <w:pPr>
         <w:numPr>
           <w:ilvl w:val="0"/>
-          <w:numId w:val="8"/>
+          <w:numId w:val="2"/>
         </w:numPr>
       </w:pPr>
       <w:r>
@@ -261,61 +280,39 @@
           <w:b/>
           <w:bCs/>
         </w:rPr>
-        <w:t>Frontend Engineering:</w:t>
-      </w:r>
-      <w:r>
-        <w:t xml:space="preserve"> Architected Elara, the CMS's custom Vanilla JS Single Page Application (SPA) router, which parses JSON payloads to dynamically swap entire site themes and UI architectures per route, bypassing traditional monolithic plugin bloat.</w:t>
-      </w:r>
-    </w:p>
-    <w:p>
-      <w:pPr>
-        <w:numPr>
-          <w:ilvl w:val="0"/>
-          <w:numId w:val="8"/>
-        </w:numPr>
+        <w:t>Frontend Data Delivery:</w:t>
+      </w:r>
+      <w:r>
+        <w:t xml:space="preserve"> Architected 'Elara', a custom Vanilla JS SPA router that parses complex JSON payloads to dynamically render accessible UI architectures, actively reducing cognitive load and embedding strict WCAG 2.1 AA/Section 508 compliance at the architectural root.</w:t>
+      </w:r>
+    </w:p>
+    <w:p>
+      <w:pPr>
+        <w:pStyle w:val="Heading2"/>
       </w:pPr>
       <w:r>
         <w:rPr>
           <w:b/>
           <w:bCs/>
         </w:rPr>
-        <w:t>Deployment Automation:</w:t>
-      </w:r>
-      <w:r>
-        <w:t xml:space="preserve"> Designed decoupled Bash CI/CD pipeline agents (Jenna and Sarah) that execute high-frequency, atomic deployments, achieving zero-downtime server synchronization with the frictionless speed of a local file save.</w:t>
-      </w:r>
-    </w:p>
-    <w:p>
-      <w:pPr>
-        <w:numPr>
-          <w:ilvl w:val="0"/>
-          <w:numId w:val="8"/>
-        </w:numPr>
-      </w:pPr>
+        <w:t>Clerk-Cashier (Functional Data Integration Lead)</w:t>
+      </w:r>
       <w:r>
         <w:rPr>
           <w:b/>
           <w:bCs/>
         </w:rPr>
-        <w:t>Cloud Infrastructure:</w:t>
-      </w:r>
-      <w:r>
-        <w:t xml:space="preserve"> Executed a strategic infrastructure migration from restrictive legacy hosting to a high-performance Linux environment on </w:t>
-      </w:r>
-      <w:proofErr w:type="spellStart"/>
-      <w:r>
-        <w:t>DigitalOcean</w:t>
-      </w:r>
-      <w:proofErr w:type="spellEnd"/>
-      <w:r>
-        <w:t>, secured by Cloudflare edge networking and custom Nginx reverse proxies.</w:t>
+        <w:t xml:space="preserve"> </w:t>
+      </w:r>
+      <w:r>
+        <w:t>City of Virginia Beach Parks &amp; Recreation | Virginia Beach, VA | May 2023 – Present</w:t>
       </w:r>
     </w:p>
     <w:p>
       <w:pPr>
         <w:numPr>
           <w:ilvl w:val="0"/>
-          <w:numId w:val="8"/>
+          <w:numId w:val="3"/>
         </w:numPr>
       </w:pPr>
       <w:r>
@@ -323,32 +320,43 @@
           <w:b/>
           <w:bCs/>
         </w:rPr>
-        <w:t>Accessibility First:</w:t>
-      </w:r>
-      <w:r>
-        <w:t xml:space="preserve"> Embedded strict WCAG 2.1 AA and Section 508 compliance natively into the framework layout, prioritizing "Empathetic Engineering" through dynamic ARIA focus management and cognitive-load reduction.</w:t>
-      </w:r>
-    </w:p>
-    <w:p>
-      <w:pPr>
-        <w:pStyle w:val="Heading2"/>
+        <w:t>Data Engineering &amp; ETL Pipelines:</w:t>
+      </w:r>
+      <w:r>
+        <w:t xml:space="preserve"> Architect and manage manual ETL (Extract-Transform-Load) pipelines to ingest, normalize, and secure complex operational and financial data from legacy enterprise platforms (</w:t>
+      </w:r>
+      <w:proofErr w:type="spellStart"/>
+      <w:r>
+        <w:t>ActiveNet</w:t>
+      </w:r>
+      <w:proofErr w:type="spellEnd"/>
+      <w:r>
+        <w:t>) into highly accessible digital formats.</w:t>
+      </w:r>
+    </w:p>
+    <w:p>
+      <w:pPr>
+        <w:numPr>
+          <w:ilvl w:val="0"/>
+          <w:numId w:val="3"/>
+        </w:numPr>
       </w:pPr>
       <w:r>
         <w:rPr>
           <w:b/>
           <w:bCs/>
         </w:rPr>
-        <w:t>Technical Lead &amp; Data Normalization Specialist</w:t>
-      </w:r>
-      <w:r>
-        <w:t xml:space="preserve"> City of Virginia Beach Parks &amp; Recreation | Virginia Beach, VA | May 2023 – Present</w:t>
+        <w:t>Player-Coach Leadership &amp; Training:</w:t>
+      </w:r>
+      <w:r>
+        <w:t xml:space="preserve"> Serve as the primary technical trainer and operational escalation point for municipal staff, translating complex data integrity protocols and Revenue Cycle Management (RCM) compliance into actionable training programs.</w:t>
       </w:r>
     </w:p>
     <w:p>
       <w:pPr>
         <w:numPr>
           <w:ilvl w:val="0"/>
-          <w:numId w:val="9"/>
+          <w:numId w:val="3"/>
         </w:numPr>
       </w:pPr>
       <w:r>
@@ -356,34 +364,33 @@
           <w:b/>
           <w:bCs/>
         </w:rPr>
-        <w:t>Legacy Data Normalization:</w:t>
-      </w:r>
-      <w:r>
-        <w:t xml:space="preserve"> Engineered a manual ETL (Extract-Transform-Load) pipeline to normalize legacy municipal reservation data from the </w:t>
-      </w:r>
-      <w:proofErr w:type="spellStart"/>
-      <w:r>
-        <w:t>ActiveNet</w:t>
-      </w:r>
-      <w:proofErr w:type="spellEnd"/>
-      <w:r>
-        <w:t xml:space="preserve"> CRM into fully </w:t>
-      </w:r>
-      <w:proofErr w:type="gramStart"/>
-      <w:r>
-        <w:t>accessible,</w:t>
-      </w:r>
-      <w:proofErr w:type="gramEnd"/>
-      <w:r>
-        <w:t xml:space="preserve"> digital formats.</w:t>
+        <w:t>Stakeholder &amp; Governance Management:</w:t>
+      </w:r>
+      <w:r>
+        <w:t xml:space="preserve"> Partner with facility leadership to optimize resource allocation, resolving complex logistical conflicts through data-driven insights and strict adherence to municipal policy.</w:t>
       </w:r>
     </w:p>
     <w:p>
       <w:pPr>
         <w:numPr>
           <w:ilvl w:val="0"/>
-          <w:numId w:val="9"/>
+          <w:numId w:val="3"/>
         </w:numPr>
+      </w:pPr>
+      <w:r>
+        <w:rPr>
+          <w:b/>
+          <w:bCs/>
+        </w:rPr>
+        <w:t>Compliance Enforcement:</w:t>
+      </w:r>
+      <w:r>
+        <w:t xml:space="preserve"> Govern output data to guarantee strict Section 508 compliance across all generated operational documents from legacy systems, ensuring institutional adherence to federal accessibility mandates.</w:t>
+      </w:r>
+    </w:p>
+    <w:p>
+      <w:pPr>
+        <w:pStyle w:val="Heading2"/>
       </w:pPr>
       <w:r>
         <w:rPr>
@@ -391,17 +398,17 @@
           <w:bCs/>
         </w:rPr>
         <w:lastRenderedPageBreak/>
-        <w:t>Compliance Enforcement:</w:t>
-      </w:r>
-      <w:r>
-        <w:t xml:space="preserve"> Enforced strict Section 508 compliance for all generated operational documents from a legacy system not designed for such outputs, optimizing internal facility workflows and resource allocation.</w:t>
+        <w:t>Computer Operations Technician (Functional Accessibility Specialist)</w:t>
+      </w:r>
+      <w:r>
+        <w:t xml:space="preserve"> Old Dominion University (ODU Online) | Norfolk, VA | Nov 2019 – Jul 2022</w:t>
       </w:r>
     </w:p>
     <w:p>
       <w:pPr>
         <w:numPr>
           <w:ilvl w:val="0"/>
-          <w:numId w:val="9"/>
+          <w:numId w:val="4"/>
         </w:numPr>
       </w:pPr>
       <w:r>
@@ -409,25 +416,17 @@
           <w:b/>
           <w:bCs/>
         </w:rPr>
-        <w:t>Technical Training:</w:t>
-      </w:r>
-      <w:r>
-        <w:t xml:space="preserve"> Serve as the primary technical trainer for municipal staff on the </w:t>
-      </w:r>
-      <w:proofErr w:type="spellStart"/>
-      <w:r>
-        <w:t>ActiveNet</w:t>
-      </w:r>
-      <w:proofErr w:type="spellEnd"/>
-      <w:r>
-        <w:t xml:space="preserve"> CRM, establishing strict data integrity protocols and payment processing security.</w:t>
+        <w:t>Enterprise Accessibility Strategy:</w:t>
+      </w:r>
+      <w:r>
+        <w:t xml:space="preserve"> Served as the primary technical gatekeeper for enterprise-level data and web content during a massive, university-wide digital infrastructure migration to the Canvas LMS.</w:t>
       </w:r>
     </w:p>
     <w:p>
       <w:pPr>
         <w:numPr>
           <w:ilvl w:val="0"/>
-          <w:numId w:val="9"/>
+          <w:numId w:val="4"/>
         </w:numPr>
       </w:pPr>
       <w:r>
@@ -435,82 +434,17 @@
           <w:b/>
           <w:bCs/>
         </w:rPr>
-        <w:t>Operational Leadership:</w:t>
-      </w:r>
-      <w:r>
-        <w:t xml:space="preserve"> </w:t>
-      </w:r>
-      <w:r>
-        <w:t>Function as the primary escalation point for resolving complex facility logistical conflicts and overseeing high-volume Revenue Cycle Management (RCM) and financial reconciliation, making independent technical and policy-aligned decisions</w:t>
-      </w:r>
-      <w:r>
-        <w:t>.</w:t>
-      </w:r>
-    </w:p>
-    <w:p>
-      <w:pPr>
-        <w:pStyle w:val="Heading2"/>
-      </w:pPr>
-      <w:r>
-        <w:rPr>
-          <w:b/>
-          <w:bCs/>
-        </w:rPr>
-        <w:t>Section 508 Compliance Specialist</w:t>
-      </w:r>
-      <w:r>
-        <w:t xml:space="preserve"> Old Dominion University (ODU Online) | Norfolk, VA | Nov 2019 – Jul 2022</w:t>
+        <w:t>Compliance Auditing:</w:t>
+      </w:r>
+      <w:r>
+        <w:t xml:space="preserve"> Executed rigorous WCAG 2.1 AA and Section 508 compliance audits, remediating complex codebases (HTML/CSS) and ensuring strict structural integrity across institutional platforms using tools like Deque axe.</w:t>
       </w:r>
     </w:p>
     <w:p>
       <w:pPr>
         <w:numPr>
           <w:ilvl w:val="0"/>
-          <w:numId w:val="10"/>
-        </w:numPr>
-      </w:pPr>
-      <w:r>
-        <w:rPr>
-          <w:b/>
-          <w:bCs/>
-        </w:rPr>
-        <w:t>Enterprise Accessibility:</w:t>
-      </w:r>
-      <w:r>
-        <w:t xml:space="preserve"> Served as the primary accessibility gatekeeper for enterprise-level web content during a massive university-wide migration to </w:t>
-      </w:r>
-      <w:proofErr w:type="gramStart"/>
-      <w:r>
-        <w:t>the Canvas</w:t>
-      </w:r>
-      <w:proofErr w:type="gramEnd"/>
-      <w:r>
-        <w:t xml:space="preserve"> LMS.</w:t>
-      </w:r>
-    </w:p>
-    <w:p>
-      <w:pPr>
-        <w:numPr>
-          <w:ilvl w:val="0"/>
-          <w:numId w:val="10"/>
-        </w:numPr>
-      </w:pPr>
-      <w:r>
-        <w:rPr>
-          <w:b/>
-          <w:bCs/>
-        </w:rPr>
-        <w:t>Remediation &amp; Auditing:</w:t>
-      </w:r>
-      <w:r>
-        <w:t xml:space="preserve"> Enforced strict WCAG 2.1 AA and Section 508 compliance parameters, remediating complex HTML/CSS code and verifying structural integrity using tools like Deque axe.</w:t>
-      </w:r>
-    </w:p>
-    <w:p>
-      <w:pPr>
-        <w:numPr>
-          <w:ilvl w:val="0"/>
-          <w:numId w:val="10"/>
+          <w:numId w:val="4"/>
         </w:numPr>
       </w:pPr>
       <w:r>
@@ -521,7 +455,7 @@
         <w:t>Architectural Standardization:</w:t>
       </w:r>
       <w:r>
-        <w:t xml:space="preserve"> Designed and engineered a universal, inherently accessible architectural template deployed across university-wide syllabi, significantly streamlining workflows for instructional design faculty.</w:t>
+        <w:t xml:space="preserve"> Engineered universal, inherently accessible data/architectural templates deployed across the university ecosystem, heavily streamlining data-entry workflows for instructional design faculty.</w:t>
       </w:r>
     </w:p>
     <w:p>
@@ -543,26 +477,18 @@
       <w:pPr>
         <w:numPr>
           <w:ilvl w:val="0"/>
-          <w:numId w:val="11"/>
+          <w:numId w:val="5"/>
         </w:numPr>
       </w:pPr>
       <w:r>
-        <w:t xml:space="preserve">Engineered cross-platform mobile applications for iOS and Android utilizing </w:t>
-      </w:r>
-      <w:proofErr w:type="gramStart"/>
-      <w:r>
-        <w:t>the JavaScript</w:t>
-      </w:r>
-      <w:proofErr w:type="gramEnd"/>
-      <w:r>
-        <w:t>-based Titanium SDK.</w:t>
+        <w:t>Engineered cross-platform mobile applications for iOS and Android utilizing the JavaScript-based Titanium SDK.</w:t>
       </w:r>
     </w:p>
     <w:p>
       <w:pPr>
         <w:numPr>
           <w:ilvl w:val="0"/>
-          <w:numId w:val="11"/>
+          <w:numId w:val="5"/>
         </w:numPr>
       </w:pPr>
       <w:r>
@@ -581,7 +507,7 @@
       <w:pPr>
         <w:numPr>
           <w:ilvl w:val="0"/>
-          <w:numId w:val="12"/>
+          <w:numId w:val="6"/>
         </w:numPr>
       </w:pPr>
       <w:r>
@@ -592,21 +518,14 @@
         <w:t>Tidewater Community College</w:t>
       </w:r>
       <w:r>
-        <w:t xml:space="preserve"> | Virginia Beach, VA Associate of Science, Information Technology (Focus: Software Engineering &amp; Web Dev) | </w:t>
-      </w:r>
-      <w:r>
-        <w:rPr>
-          <w:i/>
-          <w:iCs/>
-        </w:rPr>
-        <w:t>Expected Dec 2026</w:t>
+        <w:t xml:space="preserve"> | Virginia Beach, VA Associate of Science, Information Technology (Focus: Software Engineering &amp; Web Dev) | Expected Dec 2026</w:t>
       </w:r>
     </w:p>
     <w:p>
       <w:pPr>
         <w:numPr>
           <w:ilvl w:val="0"/>
-          <w:numId w:val="12"/>
+          <w:numId w:val="6"/>
         </w:numPr>
       </w:pPr>
       <w:r>
@@ -617,21 +536,14 @@
         <w:t>Old Dominion University</w:t>
       </w:r>
       <w:r>
-        <w:t xml:space="preserve"> | Norfolk, VA Bachelor of Science, Customized Studies in Leadership | </w:t>
-      </w:r>
-      <w:r>
-        <w:rPr>
-          <w:i/>
-          <w:iCs/>
-        </w:rPr>
-        <w:t>In Progress</w:t>
+        <w:t xml:space="preserve"> | Norfolk, VA Bachelor of Science, Customized Studies in Leadership | In Progress</w:t>
       </w:r>
     </w:p>
     <w:p>
       <w:pPr>
         <w:numPr>
           <w:ilvl w:val="0"/>
-          <w:numId w:val="12"/>
+          <w:numId w:val="6"/>
         </w:numPr>
       </w:pPr>
       <w:r>
@@ -639,17 +551,10 @@
           <w:b/>
           <w:bCs/>
         </w:rPr>
-        <w:t>Wilson Workforce &amp; Rehabilitation Center</w:t>
-      </w:r>
-      <w:r>
-        <w:t xml:space="preserve"> | Fishersville, VA Certificate, Business &amp; Information Technology | </w:t>
-      </w:r>
-      <w:r>
-        <w:rPr>
-          <w:i/>
-          <w:iCs/>
-        </w:rPr>
-        <w:t>2011</w:t>
+        <w:t>Wilson Workforce and Rehabilitation Center (formerly Woodrow Wilson Rehabilitation Center)</w:t>
+      </w:r>
+      <w:r>
+        <w:t xml:space="preserve"> | Fishersville, VA Certificate, Business &amp; Information Technology | 2011</w:t>
       </w:r>
     </w:p>
     <w:p/>
@@ -666,9 +571,9 @@
 <file path=word/numbering.xml><?xml version="1.0" encoding="utf-8"?>
 <w:numbering xmlns:wpc="http://schemas.microsoft.com/office/word/2010/wordprocessingCanvas" xmlns:cx="http://schemas.microsoft.com/office/drawing/2014/chartex" xmlns:cx1="http://schemas.microsoft.com/office/drawing/2015/9/8/chartex" xmlns:cx2="http://schemas.microsoft.com/office/drawing/2015/10/21/chartex" xmlns:cx3="http://schemas.microsoft.com/office/drawing/2016/5/9/chartex" xmlns:cx4="http://schemas.microsoft.com/office/drawing/2016/5/10/chartex" xmlns:cx5="http://schemas.microsoft.com/office/drawing/2016/5/11/chartex" xmlns:cx6="http://schemas.microsoft.com/office/drawing/2016/5/12/chartex" xmlns:cx7="http://schemas.microsoft.com/office/drawing/2016/5/13/chartex" xmlns:cx8="http://schemas.microsoft.com/office/drawing/2016/5/14/chartex" xmlns:mc="http://schemas.openxmlformats.org/markup-compatibility/2006" xmlns:aink="http://schemas.microsoft.com/office/drawing/2016/ink" xmlns:am3d="http://schemas.microsoft.com/office/drawing/2017/model3d" xmlns:o="urn:schemas-microsoft-com:office:office" xmlns:oel="http://schemas.microsoft.com/office/2019/extlst" xmlns:r="http://schemas.openxmlformats.org/officeDocument/2006/relationships" xmlns:m="http://schemas.openxmlformats.org/officeDocument/2006/math" xmlns:v="urn:schemas-microsoft-com:vml" xmlns:wp14="http://schemas.microsoft.com/office/word/2010/wordprocessingDrawing" xmlns:wp="http://schemas.openxmlformats.org/drawingml/2006/wordprocessingDrawing" xmlns:w10="urn:schemas-microsoft-com:office:word" xmlns:w="http://schemas.openxmlformats.org/wordprocessingml/2006/main" xmlns:w14="http://schemas.microsoft.com/office/word/2010/wordml" xmlns:w15="http://schemas.microsoft.com/office/word/2012/wordml" xmlns:w16cex="http://schemas.microsoft.com/office/word/2018/wordml/cex" xmlns:w16cid="http://schemas.microsoft.com/office/word/2016/wordml/cid" xmlns:w16="http://schemas.microsoft.com/office/word/2018/wordml" xmlns:w16du="http://schemas.microsoft.com/office/word/2023/wordml/word16du" xmlns:w16sdtdh="http://schemas.microsoft.com/office/word/2020/wordml/sdtdatahash" xmlns:w16sdtfl="http://schemas.microsoft.com/office/word/2024/wordml/sdtformatlock" xmlns:w16se="http://schemas.microsoft.com/office/word/2015/wordml/symex" xmlns:wpg="http://schemas.microsoft.com/office/word/2010/wordprocessingGroup" xmlns:wpi="http://schemas.microsoft.com/office/word/2010/wordprocessingInk" xmlns:wne="http://schemas.microsoft.com/office/word/2006/wordml" xmlns:wps="http://schemas.microsoft.com/office/word/2010/wordprocessingShape" mc:Ignorable="w14 w15 w16se w16cid w16 w16cex w16sdtdh w16sdtfl w16du wp14">
   <w:abstractNum w:abstractNumId="0" w15:restartNumberingAfterBreak="0">
-    <w:nsid w:val="13270098"/>
+    <w:nsid w:val="12EE5E0D"/>
     <w:multiLevelType w:val="multilevel"/>
-    <w:tmpl w:val="DF22DE56"/>
+    <w:tmpl w:val="C11A80F0"/>
     <w:lvl w:ilvl="0">
       <w:start w:val="1"/>
       <w:numFmt w:val="bullet"/>
@@ -815,9 +720,9 @@
     </w:lvl>
   </w:abstractNum>
   <w:abstractNum w:abstractNumId="1" w15:restartNumberingAfterBreak="0">
-    <w:nsid w:val="209C2EB5"/>
+    <w:nsid w:val="179B3BC5"/>
     <w:multiLevelType w:val="multilevel"/>
-    <w:tmpl w:val="3CCCF220"/>
+    <w:tmpl w:val="5D0E4570"/>
     <w:lvl w:ilvl="0">
       <w:start w:val="1"/>
       <w:numFmt w:val="bullet"/>
@@ -964,9 +869,9 @@
     </w:lvl>
   </w:abstractNum>
   <w:abstractNum w:abstractNumId="2" w15:restartNumberingAfterBreak="0">
-    <w:nsid w:val="2B761A45"/>
+    <w:nsid w:val="4B890B48"/>
     <w:multiLevelType w:val="multilevel"/>
-    <w:tmpl w:val="DE40E7C6"/>
+    <w:tmpl w:val="E00A91C8"/>
     <w:lvl w:ilvl="0">
       <w:start w:val="1"/>
       <w:numFmt w:val="bullet"/>
@@ -1113,9 +1018,9 @@
     </w:lvl>
   </w:abstractNum>
   <w:abstractNum w:abstractNumId="3" w15:restartNumberingAfterBreak="0">
-    <w:nsid w:val="3AD536FE"/>
+    <w:nsid w:val="56676E96"/>
     <w:multiLevelType w:val="multilevel"/>
-    <w:tmpl w:val="FAE0EC62"/>
+    <w:tmpl w:val="6338D58E"/>
     <w:lvl w:ilvl="0">
       <w:start w:val="1"/>
       <w:numFmt w:val="bullet"/>
@@ -1262,9 +1167,9 @@
     </w:lvl>
   </w:abstractNum>
   <w:abstractNum w:abstractNumId="4" w15:restartNumberingAfterBreak="0">
-    <w:nsid w:val="491738B4"/>
+    <w:nsid w:val="609B72C6"/>
     <w:multiLevelType w:val="multilevel"/>
-    <w:tmpl w:val="0C1A8EC2"/>
+    <w:tmpl w:val="B700E8D4"/>
     <w:lvl w:ilvl="0">
       <w:start w:val="1"/>
       <w:numFmt w:val="bullet"/>
@@ -1411,9 +1316,9 @@
     </w:lvl>
   </w:abstractNum>
   <w:abstractNum w:abstractNumId="5" w15:restartNumberingAfterBreak="0">
-    <w:nsid w:val="4AD51A7D"/>
+    <w:nsid w:val="744E230A"/>
     <w:multiLevelType w:val="multilevel"/>
-    <w:tmpl w:val="A5BCB46A"/>
+    <w:tmpl w:val="C4FC7258"/>
     <w:lvl w:ilvl="0">
       <w:start w:val="1"/>
       <w:numFmt w:val="bullet"/>
@@ -1559,937 +1464,24 @@
       </w:rPr>
     </w:lvl>
   </w:abstractNum>
-  <w:abstractNum w:abstractNumId="6" w15:restartNumberingAfterBreak="0">
-    <w:nsid w:val="50BA3D71"/>
-    <w:multiLevelType w:val="multilevel"/>
-    <w:tmpl w:val="8DDCA238"/>
-    <w:lvl w:ilvl="0">
-      <w:start w:val="1"/>
-      <w:numFmt w:val="bullet"/>
-      <w:lvlText w:val=""/>
-      <w:lvlJc w:val="left"/>
-      <w:pPr>
-        <w:tabs>
-          <w:tab w:val="num" w:pos="720"/>
-        </w:tabs>
-        <w:ind w:left="720" w:hanging="360"/>
-      </w:pPr>
-      <w:rPr>
-        <w:rFonts w:ascii="Symbol" w:hAnsi="Symbol" w:hint="default"/>
-        <w:sz w:val="20"/>
-      </w:rPr>
-    </w:lvl>
-    <w:lvl w:ilvl="1" w:tentative="1">
-      <w:start w:val="1"/>
-      <w:numFmt w:val="bullet"/>
-      <w:lvlText w:val="o"/>
-      <w:lvlJc w:val="left"/>
-      <w:pPr>
-        <w:tabs>
-          <w:tab w:val="num" w:pos="1440"/>
-        </w:tabs>
-        <w:ind w:left="1440" w:hanging="360"/>
-      </w:pPr>
-      <w:rPr>
-        <w:rFonts w:ascii="Courier New" w:hAnsi="Courier New" w:hint="default"/>
-        <w:sz w:val="20"/>
-      </w:rPr>
-    </w:lvl>
-    <w:lvl w:ilvl="2" w:tentative="1">
-      <w:start w:val="1"/>
-      <w:numFmt w:val="bullet"/>
-      <w:lvlText w:val=""/>
-      <w:lvlJc w:val="left"/>
-      <w:pPr>
-        <w:tabs>
-          <w:tab w:val="num" w:pos="2160"/>
-        </w:tabs>
-        <w:ind w:left="2160" w:hanging="360"/>
-      </w:pPr>
-      <w:rPr>
-        <w:rFonts w:ascii="Wingdings" w:hAnsi="Wingdings" w:hint="default"/>
-        <w:sz w:val="20"/>
-      </w:rPr>
-    </w:lvl>
-    <w:lvl w:ilvl="3" w:tentative="1">
-      <w:start w:val="1"/>
-      <w:numFmt w:val="bullet"/>
-      <w:lvlText w:val=""/>
-      <w:lvlJc w:val="left"/>
-      <w:pPr>
-        <w:tabs>
-          <w:tab w:val="num" w:pos="2880"/>
-        </w:tabs>
-        <w:ind w:left="2880" w:hanging="360"/>
-      </w:pPr>
-      <w:rPr>
-        <w:rFonts w:ascii="Wingdings" w:hAnsi="Wingdings" w:hint="default"/>
-        <w:sz w:val="20"/>
-      </w:rPr>
-    </w:lvl>
-    <w:lvl w:ilvl="4" w:tentative="1">
-      <w:start w:val="1"/>
-      <w:numFmt w:val="bullet"/>
-      <w:lvlText w:val=""/>
-      <w:lvlJc w:val="left"/>
-      <w:pPr>
-        <w:tabs>
-          <w:tab w:val="num" w:pos="3600"/>
-        </w:tabs>
-        <w:ind w:left="3600" w:hanging="360"/>
-      </w:pPr>
-      <w:rPr>
-        <w:rFonts w:ascii="Wingdings" w:hAnsi="Wingdings" w:hint="default"/>
-        <w:sz w:val="20"/>
-      </w:rPr>
-    </w:lvl>
-    <w:lvl w:ilvl="5" w:tentative="1">
-      <w:start w:val="1"/>
-      <w:numFmt w:val="bullet"/>
-      <w:lvlText w:val=""/>
-      <w:lvlJc w:val="left"/>
-      <w:pPr>
-        <w:tabs>
-          <w:tab w:val="num" w:pos="4320"/>
-        </w:tabs>
-        <w:ind w:left="4320" w:hanging="360"/>
-      </w:pPr>
-      <w:rPr>
-        <w:rFonts w:ascii="Wingdings" w:hAnsi="Wingdings" w:hint="default"/>
-        <w:sz w:val="20"/>
-      </w:rPr>
-    </w:lvl>
-    <w:lvl w:ilvl="6" w:tentative="1">
-      <w:start w:val="1"/>
-      <w:numFmt w:val="bullet"/>
-      <w:lvlText w:val=""/>
-      <w:lvlJc w:val="left"/>
-      <w:pPr>
-        <w:tabs>
-          <w:tab w:val="num" w:pos="5040"/>
-        </w:tabs>
-        <w:ind w:left="5040" w:hanging="360"/>
-      </w:pPr>
-      <w:rPr>
-        <w:rFonts w:ascii="Wingdings" w:hAnsi="Wingdings" w:hint="default"/>
-        <w:sz w:val="20"/>
-      </w:rPr>
-    </w:lvl>
-    <w:lvl w:ilvl="7" w:tentative="1">
-      <w:start w:val="1"/>
-      <w:numFmt w:val="bullet"/>
-      <w:lvlText w:val=""/>
-      <w:lvlJc w:val="left"/>
-      <w:pPr>
-        <w:tabs>
-          <w:tab w:val="num" w:pos="5760"/>
-        </w:tabs>
-        <w:ind w:left="5760" w:hanging="360"/>
-      </w:pPr>
-      <w:rPr>
-        <w:rFonts w:ascii="Wingdings" w:hAnsi="Wingdings" w:hint="default"/>
-        <w:sz w:val="20"/>
-      </w:rPr>
-    </w:lvl>
-    <w:lvl w:ilvl="8" w:tentative="1">
-      <w:start w:val="1"/>
-      <w:numFmt w:val="bullet"/>
-      <w:lvlText w:val=""/>
-      <w:lvlJc w:val="left"/>
-      <w:pPr>
-        <w:tabs>
-          <w:tab w:val="num" w:pos="6480"/>
-        </w:tabs>
-        <w:ind w:left="6480" w:hanging="360"/>
-      </w:pPr>
-      <w:rPr>
-        <w:rFonts w:ascii="Wingdings" w:hAnsi="Wingdings" w:hint="default"/>
-        <w:sz w:val="20"/>
-      </w:rPr>
-    </w:lvl>
-  </w:abstractNum>
-  <w:abstractNum w:abstractNumId="7" w15:restartNumberingAfterBreak="0">
-    <w:nsid w:val="5A3E4B9C"/>
-    <w:multiLevelType w:val="multilevel"/>
-    <w:tmpl w:val="E752F650"/>
-    <w:lvl w:ilvl="0">
-      <w:start w:val="1"/>
-      <w:numFmt w:val="bullet"/>
-      <w:lvlText w:val=""/>
-      <w:lvlJc w:val="left"/>
-      <w:pPr>
-        <w:tabs>
-          <w:tab w:val="num" w:pos="720"/>
-        </w:tabs>
-        <w:ind w:left="720" w:hanging="360"/>
-      </w:pPr>
-      <w:rPr>
-        <w:rFonts w:ascii="Symbol" w:hAnsi="Symbol" w:hint="default"/>
-        <w:sz w:val="20"/>
-      </w:rPr>
-    </w:lvl>
-    <w:lvl w:ilvl="1" w:tentative="1">
-      <w:start w:val="1"/>
-      <w:numFmt w:val="bullet"/>
-      <w:lvlText w:val="o"/>
-      <w:lvlJc w:val="left"/>
-      <w:pPr>
-        <w:tabs>
-          <w:tab w:val="num" w:pos="1440"/>
-        </w:tabs>
-        <w:ind w:left="1440" w:hanging="360"/>
-      </w:pPr>
-      <w:rPr>
-        <w:rFonts w:ascii="Courier New" w:hAnsi="Courier New" w:hint="default"/>
-        <w:sz w:val="20"/>
-      </w:rPr>
-    </w:lvl>
-    <w:lvl w:ilvl="2" w:tentative="1">
-      <w:start w:val="1"/>
-      <w:numFmt w:val="bullet"/>
-      <w:lvlText w:val=""/>
-      <w:lvlJc w:val="left"/>
-      <w:pPr>
-        <w:tabs>
-          <w:tab w:val="num" w:pos="2160"/>
-        </w:tabs>
-        <w:ind w:left="2160" w:hanging="360"/>
-      </w:pPr>
-      <w:rPr>
-        <w:rFonts w:ascii="Wingdings" w:hAnsi="Wingdings" w:hint="default"/>
-        <w:sz w:val="20"/>
-      </w:rPr>
-    </w:lvl>
-    <w:lvl w:ilvl="3" w:tentative="1">
-      <w:start w:val="1"/>
-      <w:numFmt w:val="bullet"/>
-      <w:lvlText w:val=""/>
-      <w:lvlJc w:val="left"/>
-      <w:pPr>
-        <w:tabs>
-          <w:tab w:val="num" w:pos="2880"/>
-        </w:tabs>
-        <w:ind w:left="2880" w:hanging="360"/>
-      </w:pPr>
-      <w:rPr>
-        <w:rFonts w:ascii="Wingdings" w:hAnsi="Wingdings" w:hint="default"/>
-        <w:sz w:val="20"/>
-      </w:rPr>
-    </w:lvl>
-    <w:lvl w:ilvl="4" w:tentative="1">
-      <w:start w:val="1"/>
-      <w:numFmt w:val="bullet"/>
-      <w:lvlText w:val=""/>
-      <w:lvlJc w:val="left"/>
-      <w:pPr>
-        <w:tabs>
-          <w:tab w:val="num" w:pos="3600"/>
-        </w:tabs>
-        <w:ind w:left="3600" w:hanging="360"/>
-      </w:pPr>
-      <w:rPr>
-        <w:rFonts w:ascii="Wingdings" w:hAnsi="Wingdings" w:hint="default"/>
-        <w:sz w:val="20"/>
-      </w:rPr>
-    </w:lvl>
-    <w:lvl w:ilvl="5" w:tentative="1">
-      <w:start w:val="1"/>
-      <w:numFmt w:val="bullet"/>
-      <w:lvlText w:val=""/>
-      <w:lvlJc w:val="left"/>
-      <w:pPr>
-        <w:tabs>
-          <w:tab w:val="num" w:pos="4320"/>
-        </w:tabs>
-        <w:ind w:left="4320" w:hanging="360"/>
-      </w:pPr>
-      <w:rPr>
-        <w:rFonts w:ascii="Wingdings" w:hAnsi="Wingdings" w:hint="default"/>
-        <w:sz w:val="20"/>
-      </w:rPr>
-    </w:lvl>
-    <w:lvl w:ilvl="6" w:tentative="1">
-      <w:start w:val="1"/>
-      <w:numFmt w:val="bullet"/>
-      <w:lvlText w:val=""/>
-      <w:lvlJc w:val="left"/>
-      <w:pPr>
-        <w:tabs>
-          <w:tab w:val="num" w:pos="5040"/>
-        </w:tabs>
-        <w:ind w:left="5040" w:hanging="360"/>
-      </w:pPr>
-      <w:rPr>
-        <w:rFonts w:ascii="Wingdings" w:hAnsi="Wingdings" w:hint="default"/>
-        <w:sz w:val="20"/>
-      </w:rPr>
-    </w:lvl>
-    <w:lvl w:ilvl="7" w:tentative="1">
-      <w:start w:val="1"/>
-      <w:numFmt w:val="bullet"/>
-      <w:lvlText w:val=""/>
-      <w:lvlJc w:val="left"/>
-      <w:pPr>
-        <w:tabs>
-          <w:tab w:val="num" w:pos="5760"/>
-        </w:tabs>
-        <w:ind w:left="5760" w:hanging="360"/>
-      </w:pPr>
-      <w:rPr>
-        <w:rFonts w:ascii="Wingdings" w:hAnsi="Wingdings" w:hint="default"/>
-        <w:sz w:val="20"/>
-      </w:rPr>
-    </w:lvl>
-    <w:lvl w:ilvl="8" w:tentative="1">
-      <w:start w:val="1"/>
-      <w:numFmt w:val="bullet"/>
-      <w:lvlText w:val=""/>
-      <w:lvlJc w:val="left"/>
-      <w:pPr>
-        <w:tabs>
-          <w:tab w:val="num" w:pos="6480"/>
-        </w:tabs>
-        <w:ind w:left="6480" w:hanging="360"/>
-      </w:pPr>
-      <w:rPr>
-        <w:rFonts w:ascii="Wingdings" w:hAnsi="Wingdings" w:hint="default"/>
-        <w:sz w:val="20"/>
-      </w:rPr>
-    </w:lvl>
-  </w:abstractNum>
-  <w:abstractNum w:abstractNumId="8" w15:restartNumberingAfterBreak="0">
-    <w:nsid w:val="68FD022F"/>
-    <w:multiLevelType w:val="multilevel"/>
-    <w:tmpl w:val="D0A84444"/>
-    <w:lvl w:ilvl="0">
-      <w:start w:val="1"/>
-      <w:numFmt w:val="bullet"/>
-      <w:lvlText w:val=""/>
-      <w:lvlJc w:val="left"/>
-      <w:pPr>
-        <w:tabs>
-          <w:tab w:val="num" w:pos="720"/>
-        </w:tabs>
-        <w:ind w:left="720" w:hanging="360"/>
-      </w:pPr>
-      <w:rPr>
-        <w:rFonts w:ascii="Symbol" w:hAnsi="Symbol" w:hint="default"/>
-        <w:sz w:val="20"/>
-      </w:rPr>
-    </w:lvl>
-    <w:lvl w:ilvl="1" w:tentative="1">
-      <w:start w:val="1"/>
-      <w:numFmt w:val="bullet"/>
-      <w:lvlText w:val="o"/>
-      <w:lvlJc w:val="left"/>
-      <w:pPr>
-        <w:tabs>
-          <w:tab w:val="num" w:pos="1440"/>
-        </w:tabs>
-        <w:ind w:left="1440" w:hanging="360"/>
-      </w:pPr>
-      <w:rPr>
-        <w:rFonts w:ascii="Courier New" w:hAnsi="Courier New" w:hint="default"/>
-        <w:sz w:val="20"/>
-      </w:rPr>
-    </w:lvl>
-    <w:lvl w:ilvl="2" w:tentative="1">
-      <w:start w:val="1"/>
-      <w:numFmt w:val="bullet"/>
-      <w:lvlText w:val=""/>
-      <w:lvlJc w:val="left"/>
-      <w:pPr>
-        <w:tabs>
-          <w:tab w:val="num" w:pos="2160"/>
-        </w:tabs>
-        <w:ind w:left="2160" w:hanging="360"/>
-      </w:pPr>
-      <w:rPr>
-        <w:rFonts w:ascii="Wingdings" w:hAnsi="Wingdings" w:hint="default"/>
-        <w:sz w:val="20"/>
-      </w:rPr>
-    </w:lvl>
-    <w:lvl w:ilvl="3" w:tentative="1">
-      <w:start w:val="1"/>
-      <w:numFmt w:val="bullet"/>
-      <w:lvlText w:val=""/>
-      <w:lvlJc w:val="left"/>
-      <w:pPr>
-        <w:tabs>
-          <w:tab w:val="num" w:pos="2880"/>
-        </w:tabs>
-        <w:ind w:left="2880" w:hanging="360"/>
-      </w:pPr>
-      <w:rPr>
-        <w:rFonts w:ascii="Wingdings" w:hAnsi="Wingdings" w:hint="default"/>
-        <w:sz w:val="20"/>
-      </w:rPr>
-    </w:lvl>
-    <w:lvl w:ilvl="4" w:tentative="1">
-      <w:start w:val="1"/>
-      <w:numFmt w:val="bullet"/>
-      <w:lvlText w:val=""/>
-      <w:lvlJc w:val="left"/>
-      <w:pPr>
-        <w:tabs>
-          <w:tab w:val="num" w:pos="3600"/>
-        </w:tabs>
-        <w:ind w:left="3600" w:hanging="360"/>
-      </w:pPr>
-      <w:rPr>
-        <w:rFonts w:ascii="Wingdings" w:hAnsi="Wingdings" w:hint="default"/>
-        <w:sz w:val="20"/>
-      </w:rPr>
-    </w:lvl>
-    <w:lvl w:ilvl="5" w:tentative="1">
-      <w:start w:val="1"/>
-      <w:numFmt w:val="bullet"/>
-      <w:lvlText w:val=""/>
-      <w:lvlJc w:val="left"/>
-      <w:pPr>
-        <w:tabs>
-          <w:tab w:val="num" w:pos="4320"/>
-        </w:tabs>
-        <w:ind w:left="4320" w:hanging="360"/>
-      </w:pPr>
-      <w:rPr>
-        <w:rFonts w:ascii="Wingdings" w:hAnsi="Wingdings" w:hint="default"/>
-        <w:sz w:val="20"/>
-      </w:rPr>
-    </w:lvl>
-    <w:lvl w:ilvl="6" w:tentative="1">
-      <w:start w:val="1"/>
-      <w:numFmt w:val="bullet"/>
-      <w:lvlText w:val=""/>
-      <w:lvlJc w:val="left"/>
-      <w:pPr>
-        <w:tabs>
-          <w:tab w:val="num" w:pos="5040"/>
-        </w:tabs>
-        <w:ind w:left="5040" w:hanging="360"/>
-      </w:pPr>
-      <w:rPr>
-        <w:rFonts w:ascii="Wingdings" w:hAnsi="Wingdings" w:hint="default"/>
-        <w:sz w:val="20"/>
-      </w:rPr>
-    </w:lvl>
-    <w:lvl w:ilvl="7" w:tentative="1">
-      <w:start w:val="1"/>
-      <w:numFmt w:val="bullet"/>
-      <w:lvlText w:val=""/>
-      <w:lvlJc w:val="left"/>
-      <w:pPr>
-        <w:tabs>
-          <w:tab w:val="num" w:pos="5760"/>
-        </w:tabs>
-        <w:ind w:left="5760" w:hanging="360"/>
-      </w:pPr>
-      <w:rPr>
-        <w:rFonts w:ascii="Wingdings" w:hAnsi="Wingdings" w:hint="default"/>
-        <w:sz w:val="20"/>
-      </w:rPr>
-    </w:lvl>
-    <w:lvl w:ilvl="8" w:tentative="1">
-      <w:start w:val="1"/>
-      <w:numFmt w:val="bullet"/>
-      <w:lvlText w:val=""/>
-      <w:lvlJc w:val="left"/>
-      <w:pPr>
-        <w:tabs>
-          <w:tab w:val="num" w:pos="6480"/>
-        </w:tabs>
-        <w:ind w:left="6480" w:hanging="360"/>
-      </w:pPr>
-      <w:rPr>
-        <w:rFonts w:ascii="Wingdings" w:hAnsi="Wingdings" w:hint="default"/>
-        <w:sz w:val="20"/>
-      </w:rPr>
-    </w:lvl>
-  </w:abstractNum>
-  <w:abstractNum w:abstractNumId="9" w15:restartNumberingAfterBreak="0">
-    <w:nsid w:val="6F346E36"/>
-    <w:multiLevelType w:val="multilevel"/>
-    <w:tmpl w:val="C32E372A"/>
-    <w:lvl w:ilvl="0">
-      <w:start w:val="1"/>
-      <w:numFmt w:val="bullet"/>
-      <w:lvlText w:val=""/>
-      <w:lvlJc w:val="left"/>
-      <w:pPr>
-        <w:tabs>
-          <w:tab w:val="num" w:pos="720"/>
-        </w:tabs>
-        <w:ind w:left="720" w:hanging="360"/>
-      </w:pPr>
-      <w:rPr>
-        <w:rFonts w:ascii="Symbol" w:hAnsi="Symbol" w:hint="default"/>
-        <w:sz w:val="20"/>
-      </w:rPr>
-    </w:lvl>
-    <w:lvl w:ilvl="1" w:tentative="1">
-      <w:start w:val="1"/>
-      <w:numFmt w:val="bullet"/>
-      <w:lvlText w:val="o"/>
-      <w:lvlJc w:val="left"/>
-      <w:pPr>
-        <w:tabs>
-          <w:tab w:val="num" w:pos="1440"/>
-        </w:tabs>
-        <w:ind w:left="1440" w:hanging="360"/>
-      </w:pPr>
-      <w:rPr>
-        <w:rFonts w:ascii="Courier New" w:hAnsi="Courier New" w:hint="default"/>
-        <w:sz w:val="20"/>
-      </w:rPr>
-    </w:lvl>
-    <w:lvl w:ilvl="2" w:tentative="1">
-      <w:start w:val="1"/>
-      <w:numFmt w:val="bullet"/>
-      <w:lvlText w:val=""/>
-      <w:lvlJc w:val="left"/>
-      <w:pPr>
-        <w:tabs>
-          <w:tab w:val="num" w:pos="2160"/>
-        </w:tabs>
-        <w:ind w:left="2160" w:hanging="360"/>
-      </w:pPr>
-      <w:rPr>
-        <w:rFonts w:ascii="Wingdings" w:hAnsi="Wingdings" w:hint="default"/>
-        <w:sz w:val="20"/>
-      </w:rPr>
-    </w:lvl>
-    <w:lvl w:ilvl="3" w:tentative="1">
-      <w:start w:val="1"/>
-      <w:numFmt w:val="bullet"/>
-      <w:lvlText w:val=""/>
-      <w:lvlJc w:val="left"/>
-      <w:pPr>
-        <w:tabs>
-          <w:tab w:val="num" w:pos="2880"/>
-        </w:tabs>
-        <w:ind w:left="2880" w:hanging="360"/>
-      </w:pPr>
-      <w:rPr>
-        <w:rFonts w:ascii="Wingdings" w:hAnsi="Wingdings" w:hint="default"/>
-        <w:sz w:val="20"/>
-      </w:rPr>
-    </w:lvl>
-    <w:lvl w:ilvl="4" w:tentative="1">
-      <w:start w:val="1"/>
-      <w:numFmt w:val="bullet"/>
-      <w:lvlText w:val=""/>
-      <w:lvlJc w:val="left"/>
-      <w:pPr>
-        <w:tabs>
-          <w:tab w:val="num" w:pos="3600"/>
-        </w:tabs>
-        <w:ind w:left="3600" w:hanging="360"/>
-      </w:pPr>
-      <w:rPr>
-        <w:rFonts w:ascii="Wingdings" w:hAnsi="Wingdings" w:hint="default"/>
-        <w:sz w:val="20"/>
-      </w:rPr>
-    </w:lvl>
-    <w:lvl w:ilvl="5" w:tentative="1">
-      <w:start w:val="1"/>
-      <w:numFmt w:val="bullet"/>
-      <w:lvlText w:val=""/>
-      <w:lvlJc w:val="left"/>
-      <w:pPr>
-        <w:tabs>
-          <w:tab w:val="num" w:pos="4320"/>
-        </w:tabs>
-        <w:ind w:left="4320" w:hanging="360"/>
-      </w:pPr>
-      <w:rPr>
-        <w:rFonts w:ascii="Wingdings" w:hAnsi="Wingdings" w:hint="default"/>
-        <w:sz w:val="20"/>
-      </w:rPr>
-    </w:lvl>
-    <w:lvl w:ilvl="6" w:tentative="1">
-      <w:start w:val="1"/>
-      <w:numFmt w:val="bullet"/>
-      <w:lvlText w:val=""/>
-      <w:lvlJc w:val="left"/>
-      <w:pPr>
-        <w:tabs>
-          <w:tab w:val="num" w:pos="5040"/>
-        </w:tabs>
-        <w:ind w:left="5040" w:hanging="360"/>
-      </w:pPr>
-      <w:rPr>
-        <w:rFonts w:ascii="Wingdings" w:hAnsi="Wingdings" w:hint="default"/>
-        <w:sz w:val="20"/>
-      </w:rPr>
-    </w:lvl>
-    <w:lvl w:ilvl="7" w:tentative="1">
-      <w:start w:val="1"/>
-      <w:numFmt w:val="bullet"/>
-      <w:lvlText w:val=""/>
-      <w:lvlJc w:val="left"/>
-      <w:pPr>
-        <w:tabs>
-          <w:tab w:val="num" w:pos="5760"/>
-        </w:tabs>
-        <w:ind w:left="5760" w:hanging="360"/>
-      </w:pPr>
-      <w:rPr>
-        <w:rFonts w:ascii="Wingdings" w:hAnsi="Wingdings" w:hint="default"/>
-        <w:sz w:val="20"/>
-      </w:rPr>
-    </w:lvl>
-    <w:lvl w:ilvl="8" w:tentative="1">
-      <w:start w:val="1"/>
-      <w:numFmt w:val="bullet"/>
-      <w:lvlText w:val=""/>
-      <w:lvlJc w:val="left"/>
-      <w:pPr>
-        <w:tabs>
-          <w:tab w:val="num" w:pos="6480"/>
-        </w:tabs>
-        <w:ind w:left="6480" w:hanging="360"/>
-      </w:pPr>
-      <w:rPr>
-        <w:rFonts w:ascii="Wingdings" w:hAnsi="Wingdings" w:hint="default"/>
-        <w:sz w:val="20"/>
-      </w:rPr>
-    </w:lvl>
-  </w:abstractNum>
-  <w:abstractNum w:abstractNumId="10" w15:restartNumberingAfterBreak="0">
-    <w:nsid w:val="7BD912EF"/>
-    <w:multiLevelType w:val="multilevel"/>
-    <w:tmpl w:val="1C4CFBEA"/>
-    <w:lvl w:ilvl="0">
-      <w:start w:val="1"/>
-      <w:numFmt w:val="bullet"/>
-      <w:lvlText w:val=""/>
-      <w:lvlJc w:val="left"/>
-      <w:pPr>
-        <w:tabs>
-          <w:tab w:val="num" w:pos="720"/>
-        </w:tabs>
-        <w:ind w:left="720" w:hanging="360"/>
-      </w:pPr>
-      <w:rPr>
-        <w:rFonts w:ascii="Symbol" w:hAnsi="Symbol" w:hint="default"/>
-        <w:sz w:val="20"/>
-      </w:rPr>
-    </w:lvl>
-    <w:lvl w:ilvl="1" w:tentative="1">
-      <w:start w:val="1"/>
-      <w:numFmt w:val="bullet"/>
-      <w:lvlText w:val="o"/>
-      <w:lvlJc w:val="left"/>
-      <w:pPr>
-        <w:tabs>
-          <w:tab w:val="num" w:pos="1440"/>
-        </w:tabs>
-        <w:ind w:left="1440" w:hanging="360"/>
-      </w:pPr>
-      <w:rPr>
-        <w:rFonts w:ascii="Courier New" w:hAnsi="Courier New" w:hint="default"/>
-        <w:sz w:val="20"/>
-      </w:rPr>
-    </w:lvl>
-    <w:lvl w:ilvl="2" w:tentative="1">
-      <w:start w:val="1"/>
-      <w:numFmt w:val="bullet"/>
-      <w:lvlText w:val=""/>
-      <w:lvlJc w:val="left"/>
-      <w:pPr>
-        <w:tabs>
-          <w:tab w:val="num" w:pos="2160"/>
-        </w:tabs>
-        <w:ind w:left="2160" w:hanging="360"/>
-      </w:pPr>
-      <w:rPr>
-        <w:rFonts w:ascii="Wingdings" w:hAnsi="Wingdings" w:hint="default"/>
-        <w:sz w:val="20"/>
-      </w:rPr>
-    </w:lvl>
-    <w:lvl w:ilvl="3" w:tentative="1">
-      <w:start w:val="1"/>
-      <w:numFmt w:val="bullet"/>
-      <w:lvlText w:val=""/>
-      <w:lvlJc w:val="left"/>
-      <w:pPr>
-        <w:tabs>
-          <w:tab w:val="num" w:pos="2880"/>
-        </w:tabs>
-        <w:ind w:left="2880" w:hanging="360"/>
-      </w:pPr>
-      <w:rPr>
-        <w:rFonts w:ascii="Wingdings" w:hAnsi="Wingdings" w:hint="default"/>
-        <w:sz w:val="20"/>
-      </w:rPr>
-    </w:lvl>
-    <w:lvl w:ilvl="4" w:tentative="1">
-      <w:start w:val="1"/>
-      <w:numFmt w:val="bullet"/>
-      <w:lvlText w:val=""/>
-      <w:lvlJc w:val="left"/>
-      <w:pPr>
-        <w:tabs>
-          <w:tab w:val="num" w:pos="3600"/>
-        </w:tabs>
-        <w:ind w:left="3600" w:hanging="360"/>
-      </w:pPr>
-      <w:rPr>
-        <w:rFonts w:ascii="Wingdings" w:hAnsi="Wingdings" w:hint="default"/>
-        <w:sz w:val="20"/>
-      </w:rPr>
-    </w:lvl>
-    <w:lvl w:ilvl="5" w:tentative="1">
-      <w:start w:val="1"/>
-      <w:numFmt w:val="bullet"/>
-      <w:lvlText w:val=""/>
-      <w:lvlJc w:val="left"/>
-      <w:pPr>
-        <w:tabs>
-          <w:tab w:val="num" w:pos="4320"/>
-        </w:tabs>
-        <w:ind w:left="4320" w:hanging="360"/>
-      </w:pPr>
-      <w:rPr>
-        <w:rFonts w:ascii="Wingdings" w:hAnsi="Wingdings" w:hint="default"/>
-        <w:sz w:val="20"/>
-      </w:rPr>
-    </w:lvl>
-    <w:lvl w:ilvl="6" w:tentative="1">
-      <w:start w:val="1"/>
-      <w:numFmt w:val="bullet"/>
-      <w:lvlText w:val=""/>
-      <w:lvlJc w:val="left"/>
-      <w:pPr>
-        <w:tabs>
-          <w:tab w:val="num" w:pos="5040"/>
-        </w:tabs>
-        <w:ind w:left="5040" w:hanging="360"/>
-      </w:pPr>
-      <w:rPr>
-        <w:rFonts w:ascii="Wingdings" w:hAnsi="Wingdings" w:hint="default"/>
-        <w:sz w:val="20"/>
-      </w:rPr>
-    </w:lvl>
-    <w:lvl w:ilvl="7" w:tentative="1">
-      <w:start w:val="1"/>
-      <w:numFmt w:val="bullet"/>
-      <w:lvlText w:val=""/>
-      <w:lvlJc w:val="left"/>
-      <w:pPr>
-        <w:tabs>
-          <w:tab w:val="num" w:pos="5760"/>
-        </w:tabs>
-        <w:ind w:left="5760" w:hanging="360"/>
-      </w:pPr>
-      <w:rPr>
-        <w:rFonts w:ascii="Wingdings" w:hAnsi="Wingdings" w:hint="default"/>
-        <w:sz w:val="20"/>
-      </w:rPr>
-    </w:lvl>
-    <w:lvl w:ilvl="8" w:tentative="1">
-      <w:start w:val="1"/>
-      <w:numFmt w:val="bullet"/>
-      <w:lvlText w:val=""/>
-      <w:lvlJc w:val="left"/>
-      <w:pPr>
-        <w:tabs>
-          <w:tab w:val="num" w:pos="6480"/>
-        </w:tabs>
-        <w:ind w:left="6480" w:hanging="360"/>
-      </w:pPr>
-      <w:rPr>
-        <w:rFonts w:ascii="Wingdings" w:hAnsi="Wingdings" w:hint="default"/>
-        <w:sz w:val="20"/>
-      </w:rPr>
-    </w:lvl>
-  </w:abstractNum>
-  <w:abstractNum w:abstractNumId="11" w15:restartNumberingAfterBreak="0">
-    <w:nsid w:val="7FBE7A99"/>
-    <w:multiLevelType w:val="multilevel"/>
-    <w:tmpl w:val="16088442"/>
-    <w:lvl w:ilvl="0">
-      <w:start w:val="1"/>
-      <w:numFmt w:val="bullet"/>
-      <w:lvlText w:val=""/>
-      <w:lvlJc w:val="left"/>
-      <w:pPr>
-        <w:tabs>
-          <w:tab w:val="num" w:pos="720"/>
-        </w:tabs>
-        <w:ind w:left="720" w:hanging="360"/>
-      </w:pPr>
-      <w:rPr>
-        <w:rFonts w:ascii="Symbol" w:hAnsi="Symbol" w:hint="default"/>
-        <w:sz w:val="20"/>
-      </w:rPr>
-    </w:lvl>
-    <w:lvl w:ilvl="1" w:tentative="1">
-      <w:start w:val="1"/>
-      <w:numFmt w:val="bullet"/>
-      <w:lvlText w:val="o"/>
-      <w:lvlJc w:val="left"/>
-      <w:pPr>
-        <w:tabs>
-          <w:tab w:val="num" w:pos="1440"/>
-        </w:tabs>
-        <w:ind w:left="1440" w:hanging="360"/>
-      </w:pPr>
-      <w:rPr>
-        <w:rFonts w:ascii="Courier New" w:hAnsi="Courier New" w:hint="default"/>
-        <w:sz w:val="20"/>
-      </w:rPr>
-    </w:lvl>
-    <w:lvl w:ilvl="2" w:tentative="1">
-      <w:start w:val="1"/>
-      <w:numFmt w:val="bullet"/>
-      <w:lvlText w:val=""/>
-      <w:lvlJc w:val="left"/>
-      <w:pPr>
-        <w:tabs>
-          <w:tab w:val="num" w:pos="2160"/>
-        </w:tabs>
-        <w:ind w:left="2160" w:hanging="360"/>
-      </w:pPr>
-      <w:rPr>
-        <w:rFonts w:ascii="Wingdings" w:hAnsi="Wingdings" w:hint="default"/>
-        <w:sz w:val="20"/>
-      </w:rPr>
-    </w:lvl>
-    <w:lvl w:ilvl="3" w:tentative="1">
-      <w:start w:val="1"/>
-      <w:numFmt w:val="bullet"/>
-      <w:lvlText w:val=""/>
-      <w:lvlJc w:val="left"/>
-      <w:pPr>
-        <w:tabs>
-          <w:tab w:val="num" w:pos="2880"/>
-        </w:tabs>
-        <w:ind w:left="2880" w:hanging="360"/>
-      </w:pPr>
-      <w:rPr>
-        <w:rFonts w:ascii="Wingdings" w:hAnsi="Wingdings" w:hint="default"/>
-        <w:sz w:val="20"/>
-      </w:rPr>
-    </w:lvl>
-    <w:lvl w:ilvl="4" w:tentative="1">
-      <w:start w:val="1"/>
-      <w:numFmt w:val="bullet"/>
-      <w:lvlText w:val=""/>
-      <w:lvlJc w:val="left"/>
-      <w:pPr>
-        <w:tabs>
-          <w:tab w:val="num" w:pos="3600"/>
-        </w:tabs>
-        <w:ind w:left="3600" w:hanging="360"/>
-      </w:pPr>
-      <w:rPr>
-        <w:rFonts w:ascii="Wingdings" w:hAnsi="Wingdings" w:hint="default"/>
-        <w:sz w:val="20"/>
-      </w:rPr>
-    </w:lvl>
-    <w:lvl w:ilvl="5" w:tentative="1">
-      <w:start w:val="1"/>
-      <w:numFmt w:val="bullet"/>
-      <w:lvlText w:val=""/>
-      <w:lvlJc w:val="left"/>
-      <w:pPr>
-        <w:tabs>
-          <w:tab w:val="num" w:pos="4320"/>
-        </w:tabs>
-        <w:ind w:left="4320" w:hanging="360"/>
-      </w:pPr>
-      <w:rPr>
-        <w:rFonts w:ascii="Wingdings" w:hAnsi="Wingdings" w:hint="default"/>
-        <w:sz w:val="20"/>
-      </w:rPr>
-    </w:lvl>
-    <w:lvl w:ilvl="6" w:tentative="1">
-      <w:start w:val="1"/>
-      <w:numFmt w:val="bullet"/>
-      <w:lvlText w:val=""/>
-      <w:lvlJc w:val="left"/>
-      <w:pPr>
-        <w:tabs>
-          <w:tab w:val="num" w:pos="5040"/>
-        </w:tabs>
-        <w:ind w:left="5040" w:hanging="360"/>
-      </w:pPr>
-      <w:rPr>
-        <w:rFonts w:ascii="Wingdings" w:hAnsi="Wingdings" w:hint="default"/>
-        <w:sz w:val="20"/>
-      </w:rPr>
-    </w:lvl>
-    <w:lvl w:ilvl="7" w:tentative="1">
-      <w:start w:val="1"/>
-      <w:numFmt w:val="bullet"/>
-      <w:lvlText w:val=""/>
-      <w:lvlJc w:val="left"/>
-      <w:pPr>
-        <w:tabs>
-          <w:tab w:val="num" w:pos="5760"/>
-        </w:tabs>
-        <w:ind w:left="5760" w:hanging="360"/>
-      </w:pPr>
-      <w:rPr>
-        <w:rFonts w:ascii="Wingdings" w:hAnsi="Wingdings" w:hint="default"/>
-        <w:sz w:val="20"/>
-      </w:rPr>
-    </w:lvl>
-    <w:lvl w:ilvl="8" w:tentative="1">
-      <w:start w:val="1"/>
-      <w:numFmt w:val="bullet"/>
-      <w:lvlText w:val=""/>
-      <w:lvlJc w:val="left"/>
-      <w:pPr>
-        <w:tabs>
-          <w:tab w:val="num" w:pos="6480"/>
-        </w:tabs>
-        <w:ind w:left="6480" w:hanging="360"/>
-      </w:pPr>
-      <w:rPr>
-        <w:rFonts w:ascii="Wingdings" w:hAnsi="Wingdings" w:hint="default"/>
-        <w:sz w:val="20"/>
-      </w:rPr>
-    </w:lvl>
-  </w:abstractNum>
-  <w:num w:numId="1" w16cid:durableId="1622878175">
-    <w:abstractNumId w:val="6"/>
+  <w:num w:numId="1" w16cid:durableId="2113276056">
+    <w:abstractNumId w:val="0"/>
   </w:num>
-  <w:num w:numId="2" w16cid:durableId="99573722">
+  <w:num w:numId="2" w16cid:durableId="1303385267">
     <w:abstractNumId w:val="4"/>
   </w:num>
-  <w:num w:numId="3" w16cid:durableId="1832867279">
-    <w:abstractNumId w:val="10"/>
+  <w:num w:numId="3" w16cid:durableId="448622676">
+    <w:abstractNumId w:val="3"/>
   </w:num>
-  <w:num w:numId="4" w16cid:durableId="788088264">
+  <w:num w:numId="4" w16cid:durableId="402068395">
+    <w:abstractNumId w:val="1"/>
+  </w:num>
+  <w:num w:numId="5" w16cid:durableId="524488754">
     <w:abstractNumId w:val="2"/>
   </w:num>
-  <w:num w:numId="5" w16cid:durableId="1530414124">
+  <w:num w:numId="6" w16cid:durableId="312028010">
     <w:abstractNumId w:val="5"/>
   </w:num>
-  <w:num w:numId="6" w16cid:durableId="671568572">
-    <w:abstractNumId w:val="1"/>
-  </w:num>
-  <w:num w:numId="7" w16cid:durableId="411899350">
-    <w:abstractNumId w:val="3"/>
-  </w:num>
-  <w:num w:numId="8" w16cid:durableId="432439253">
-    <w:abstractNumId w:val="8"/>
-  </w:num>
-  <w:num w:numId="9" w16cid:durableId="192353617">
-    <w:abstractNumId w:val="7"/>
-  </w:num>
-  <w:num w:numId="10" w16cid:durableId="1428845598">
-    <w:abstractNumId w:val="9"/>
-  </w:num>
-  <w:num w:numId="11" w16cid:durableId="618220705">
-    <w:abstractNumId w:val="11"/>
-  </w:num>
-  <w:num w:numId="12" w16cid:durableId="603459037">
-    <w:abstractNumId w:val="0"/>
-  </w:num>
-  <w:numIdMacAtCleanup w:val="6"/>
 </w:numbering>
 </file>
 
@@ -2893,13 +1885,6 @@
   <w:style w:type="paragraph" w:default="1" w:styleId="Normal">
     <w:name w:val="Normal"/>
     <w:qFormat/>
-    <w:rsid w:val="004459DA"/>
-    <w:pPr>
-      <w:spacing w:after="120" w:line="240" w:lineRule="auto"/>
-    </w:pPr>
-    <w:rPr>
-      <w:sz w:val="20"/>
-    </w:rPr>
   </w:style>
   <w:style w:type="paragraph" w:styleId="Heading1">
     <w:name w:val="heading 1"/>
@@ -2908,17 +1893,17 @@
     <w:link w:val="Heading1Char"/>
     <w:uiPriority w:val="9"/>
     <w:qFormat/>
-    <w:rsid w:val="00520CC7"/>
+    <w:rsid w:val="00631DAE"/>
     <w:pPr>
       <w:keepNext/>
       <w:keepLines/>
-      <w:spacing w:before="120" w:after="80"/>
+      <w:spacing w:before="360" w:after="80"/>
       <w:outlineLvl w:val="0"/>
     </w:pPr>
     <w:rPr>
       <w:rFonts w:asciiTheme="majorHAnsi" w:eastAsiaTheme="majorEastAsia" w:hAnsiTheme="majorHAnsi" w:cstheme="majorBidi"/>
       <w:color w:val="0F4761" w:themeColor="accent1" w:themeShade="BF"/>
-      <w:sz w:val="24"/>
+      <w:sz w:val="40"/>
       <w:szCs w:val="40"/>
     </w:rPr>
   </w:style>
@@ -2930,17 +1915,17 @@
     <w:uiPriority w:val="9"/>
     <w:unhideWhenUsed/>
     <w:qFormat/>
-    <w:rsid w:val="00520CC7"/>
+    <w:rsid w:val="00631DAE"/>
     <w:pPr>
       <w:keepNext/>
       <w:keepLines/>
-      <w:spacing w:before="120" w:after="80"/>
+      <w:spacing w:before="160" w:after="80"/>
       <w:outlineLvl w:val="1"/>
     </w:pPr>
     <w:rPr>
       <w:rFonts w:asciiTheme="majorHAnsi" w:eastAsiaTheme="majorEastAsia" w:hAnsiTheme="majorHAnsi" w:cstheme="majorBidi"/>
       <w:color w:val="0F4761" w:themeColor="accent1" w:themeShade="BF"/>
-      <w:sz w:val="22"/>
+      <w:sz w:val="32"/>
       <w:szCs w:val="32"/>
     </w:rPr>
   </w:style>
@@ -2950,9 +1935,10 @@
     <w:next w:val="Normal"/>
     <w:link w:val="Heading3Char"/>
     <w:uiPriority w:val="9"/>
+    <w:semiHidden/>
     <w:unhideWhenUsed/>
     <w:qFormat/>
-    <w:rsid w:val="00E5528C"/>
+    <w:rsid w:val="00631DAE"/>
     <w:pPr>
       <w:keepNext/>
       <w:keepLines/>
@@ -2975,7 +1961,7 @@
     <w:semiHidden/>
     <w:unhideWhenUsed/>
     <w:qFormat/>
-    <w:rsid w:val="00E5528C"/>
+    <w:rsid w:val="00631DAE"/>
     <w:pPr>
       <w:keepNext/>
       <w:keepLines/>
@@ -2998,7 +1984,7 @@
     <w:semiHidden/>
     <w:unhideWhenUsed/>
     <w:qFormat/>
-    <w:rsid w:val="00E5528C"/>
+    <w:rsid w:val="00631DAE"/>
     <w:pPr>
       <w:keepNext/>
       <w:keepLines/>
@@ -3019,7 +2005,7 @@
     <w:semiHidden/>
     <w:unhideWhenUsed/>
     <w:qFormat/>
-    <w:rsid w:val="00E5528C"/>
+    <w:rsid w:val="00631DAE"/>
     <w:pPr>
       <w:keepNext/>
       <w:keepLines/>
@@ -3042,7 +2028,7 @@
     <w:semiHidden/>
     <w:unhideWhenUsed/>
     <w:qFormat/>
-    <w:rsid w:val="00E5528C"/>
+    <w:rsid w:val="00631DAE"/>
     <w:pPr>
       <w:keepNext/>
       <w:keepLines/>
@@ -3063,7 +2049,7 @@
     <w:semiHidden/>
     <w:unhideWhenUsed/>
     <w:qFormat/>
-    <w:rsid w:val="00E5528C"/>
+    <w:rsid w:val="00631DAE"/>
     <w:pPr>
       <w:keepNext/>
       <w:keepLines/>
@@ -3086,7 +2072,7 @@
     <w:semiHidden/>
     <w:unhideWhenUsed/>
     <w:qFormat/>
-    <w:rsid w:val="00E5528C"/>
+    <w:rsid w:val="00631DAE"/>
     <w:pPr>
       <w:keepNext/>
       <w:keepLines/>
@@ -3129,10 +2115,11 @@
     <w:basedOn w:val="DefaultParagraphFont"/>
     <w:link w:val="Heading1"/>
     <w:uiPriority w:val="9"/>
-    <w:rsid w:val="00520CC7"/>
+    <w:rsid w:val="00631DAE"/>
     <w:rPr>
       <w:rFonts w:asciiTheme="majorHAnsi" w:eastAsiaTheme="majorEastAsia" w:hAnsiTheme="majorHAnsi" w:cstheme="majorBidi"/>
       <w:color w:val="0F4761" w:themeColor="accent1" w:themeShade="BF"/>
+      <w:sz w:val="40"/>
       <w:szCs w:val="40"/>
     </w:rPr>
   </w:style>
@@ -3141,11 +2128,11 @@
     <w:basedOn w:val="DefaultParagraphFont"/>
     <w:link w:val="Heading2"/>
     <w:uiPriority w:val="9"/>
-    <w:rsid w:val="00520CC7"/>
+    <w:rsid w:val="00631DAE"/>
     <w:rPr>
       <w:rFonts w:asciiTheme="majorHAnsi" w:eastAsiaTheme="majorEastAsia" w:hAnsiTheme="majorHAnsi" w:cstheme="majorBidi"/>
       <w:color w:val="0F4761" w:themeColor="accent1" w:themeShade="BF"/>
-      <w:sz w:val="22"/>
+      <w:sz w:val="32"/>
       <w:szCs w:val="32"/>
     </w:rPr>
   </w:style>
@@ -3154,7 +2141,8 @@
     <w:basedOn w:val="DefaultParagraphFont"/>
     <w:link w:val="Heading3"/>
     <w:uiPriority w:val="9"/>
-    <w:rsid w:val="00E5528C"/>
+    <w:semiHidden/>
+    <w:rsid w:val="00631DAE"/>
     <w:rPr>
       <w:rFonts w:eastAsiaTheme="majorEastAsia" w:cstheme="majorBidi"/>
       <w:color w:val="0F4761" w:themeColor="accent1" w:themeShade="BF"/>
@@ -3168,7 +2156,7 @@
     <w:link w:val="Heading4"/>
     <w:uiPriority w:val="9"/>
     <w:semiHidden/>
-    <w:rsid w:val="00E5528C"/>
+    <w:rsid w:val="00631DAE"/>
     <w:rPr>
       <w:rFonts w:eastAsiaTheme="majorEastAsia" w:cstheme="majorBidi"/>
       <w:i/>
@@ -3182,7 +2170,7 @@
     <w:link w:val="Heading5"/>
     <w:uiPriority w:val="9"/>
     <w:semiHidden/>
-    <w:rsid w:val="00E5528C"/>
+    <w:rsid w:val="00631DAE"/>
     <w:rPr>
       <w:rFonts w:eastAsiaTheme="majorEastAsia" w:cstheme="majorBidi"/>
       <w:color w:val="0F4761" w:themeColor="accent1" w:themeShade="BF"/>
@@ -3194,7 +2182,7 @@
     <w:link w:val="Heading6"/>
     <w:uiPriority w:val="9"/>
     <w:semiHidden/>
-    <w:rsid w:val="00E5528C"/>
+    <w:rsid w:val="00631DAE"/>
     <w:rPr>
       <w:rFonts w:eastAsiaTheme="majorEastAsia" w:cstheme="majorBidi"/>
       <w:i/>
@@ -3208,7 +2196,7 @@
     <w:link w:val="Heading7"/>
     <w:uiPriority w:val="9"/>
     <w:semiHidden/>
-    <w:rsid w:val="00E5528C"/>
+    <w:rsid w:val="00631DAE"/>
     <w:rPr>
       <w:rFonts w:eastAsiaTheme="majorEastAsia" w:cstheme="majorBidi"/>
       <w:color w:val="595959" w:themeColor="text1" w:themeTint="A6"/>
@@ -3220,7 +2208,7 @@
     <w:link w:val="Heading8"/>
     <w:uiPriority w:val="9"/>
     <w:semiHidden/>
-    <w:rsid w:val="00E5528C"/>
+    <w:rsid w:val="00631DAE"/>
     <w:rPr>
       <w:rFonts w:eastAsiaTheme="majorEastAsia" w:cstheme="majorBidi"/>
       <w:i/>
@@ -3234,7 +2222,7 @@
     <w:link w:val="Heading9"/>
     <w:uiPriority w:val="9"/>
     <w:semiHidden/>
-    <w:rsid w:val="00E5528C"/>
+    <w:rsid w:val="00631DAE"/>
     <w:rPr>
       <w:rFonts w:eastAsiaTheme="majorEastAsia" w:cstheme="majorBidi"/>
       <w:color w:val="272727" w:themeColor="text1" w:themeTint="D8"/>
@@ -3247,16 +2235,16 @@
     <w:link w:val="TitleChar"/>
     <w:uiPriority w:val="10"/>
     <w:qFormat/>
-    <w:rsid w:val="00520CC7"/>
+    <w:rsid w:val="00631DAE"/>
     <w:pPr>
-      <w:spacing w:after="80"/>
+      <w:spacing w:after="80" w:line="240" w:lineRule="auto"/>
       <w:contextualSpacing/>
     </w:pPr>
     <w:rPr>
       <w:rFonts w:asciiTheme="majorHAnsi" w:eastAsiaTheme="majorEastAsia" w:hAnsiTheme="majorHAnsi" w:cstheme="majorBidi"/>
       <w:spacing w:val="-10"/>
       <w:kern w:val="28"/>
-      <w:sz w:val="44"/>
+      <w:sz w:val="56"/>
       <w:szCs w:val="56"/>
     </w:rPr>
   </w:style>
@@ -3265,12 +2253,12 @@
     <w:basedOn w:val="DefaultParagraphFont"/>
     <w:link w:val="Title"/>
     <w:uiPriority w:val="10"/>
-    <w:rsid w:val="00520CC7"/>
+    <w:rsid w:val="00631DAE"/>
     <w:rPr>
       <w:rFonts w:asciiTheme="majorHAnsi" w:eastAsiaTheme="majorEastAsia" w:hAnsiTheme="majorHAnsi" w:cstheme="majorBidi"/>
       <w:spacing w:val="-10"/>
       <w:kern w:val="28"/>
-      <w:sz w:val="44"/>
+      <w:sz w:val="56"/>
       <w:szCs w:val="56"/>
     </w:rPr>
   </w:style>
@@ -3281,7 +2269,7 @@
     <w:link w:val="SubtitleChar"/>
     <w:uiPriority w:val="11"/>
     <w:qFormat/>
-    <w:rsid w:val="00E5528C"/>
+    <w:rsid w:val="00631DAE"/>
     <w:pPr>
       <w:numPr>
         <w:ilvl w:val="1"/>
@@ -3300,7 +2288,7 @@
     <w:basedOn w:val="DefaultParagraphFont"/>
     <w:link w:val="Subtitle"/>
     <w:uiPriority w:val="11"/>
-    <w:rsid w:val="00E5528C"/>
+    <w:rsid w:val="00631DAE"/>
     <w:rPr>
       <w:rFonts w:eastAsiaTheme="majorEastAsia" w:cstheme="majorBidi"/>
       <w:color w:val="595959" w:themeColor="text1" w:themeTint="A6"/>
@@ -3316,7 +2304,7 @@
     <w:link w:val="QuoteChar"/>
     <w:uiPriority w:val="29"/>
     <w:qFormat/>
-    <w:rsid w:val="00E5528C"/>
+    <w:rsid w:val="00631DAE"/>
     <w:pPr>
       <w:spacing w:before="160"/>
       <w:jc w:val="center"/>
@@ -3332,7 +2320,7 @@
     <w:basedOn w:val="DefaultParagraphFont"/>
     <w:link w:val="Quote"/>
     <w:uiPriority w:val="29"/>
-    <w:rsid w:val="00E5528C"/>
+    <w:rsid w:val="00631DAE"/>
     <w:rPr>
       <w:i/>
       <w:iCs/>
@@ -3344,7 +2332,7 @@
     <w:basedOn w:val="Normal"/>
     <w:uiPriority w:val="34"/>
     <w:qFormat/>
-    <w:rsid w:val="00E5528C"/>
+    <w:rsid w:val="00631DAE"/>
     <w:pPr>
       <w:ind w:left="720"/>
       <w:contextualSpacing/>
@@ -3355,7 +2343,7 @@
     <w:basedOn w:val="DefaultParagraphFont"/>
     <w:uiPriority w:val="21"/>
     <w:qFormat/>
-    <w:rsid w:val="00E5528C"/>
+    <w:rsid w:val="00631DAE"/>
     <w:rPr>
       <w:i/>
       <w:iCs/>
@@ -3369,7 +2357,7 @@
     <w:link w:val="IntenseQuoteChar"/>
     <w:uiPriority w:val="30"/>
     <w:qFormat/>
-    <w:rsid w:val="00E5528C"/>
+    <w:rsid w:val="00631DAE"/>
     <w:pPr>
       <w:pBdr>
         <w:top w:val="single" w:sz="4" w:space="10" w:color="0F4761" w:themeColor="accent1" w:themeShade="BF"/>
@@ -3390,7 +2378,7 @@
     <w:basedOn w:val="DefaultParagraphFont"/>
     <w:link w:val="IntenseQuote"/>
     <w:uiPriority w:val="30"/>
-    <w:rsid w:val="00E5528C"/>
+    <w:rsid w:val="00631DAE"/>
     <w:rPr>
       <w:i/>
       <w:iCs/>
@@ -3402,7 +2390,7 @@
     <w:basedOn w:val="DefaultParagraphFont"/>
     <w:uiPriority w:val="32"/>
     <w:qFormat/>
-    <w:rsid w:val="00E5528C"/>
+    <w:rsid w:val="00631DAE"/>
     <w:rPr>
       <w:b/>
       <w:bCs/>
@@ -3416,7 +2404,7 @@
     <w:basedOn w:val="DefaultParagraphFont"/>
     <w:uiPriority w:val="99"/>
     <w:unhideWhenUsed/>
-    <w:rsid w:val="00E5528C"/>
+    <w:rsid w:val="00631DAE"/>
     <w:rPr>
       <w:color w:val="467886" w:themeColor="hyperlink"/>
       <w:u w:val="single"/>
@@ -3428,93 +2416,10 @@
     <w:uiPriority w:val="99"/>
     <w:semiHidden/>
     <w:unhideWhenUsed/>
-    <w:rsid w:val="00E5528C"/>
+    <w:rsid w:val="00631DAE"/>
     <w:rPr>
       <w:color w:val="605E5C"/>
       <w:shd w:val="clear" w:color="auto" w:fill="E1DFDD"/>
-    </w:rPr>
-  </w:style>
-  <w:style w:type="character" w:styleId="Strong">
-    <w:name w:val="Strong"/>
-    <w:basedOn w:val="DefaultParagraphFont"/>
-    <w:uiPriority w:val="22"/>
-    <w:qFormat/>
-    <w:rsid w:val="003D7794"/>
-    <w:rPr>
-      <w:b/>
-      <w:bCs/>
-    </w:rPr>
-  </w:style>
-  <w:style w:type="paragraph" w:customStyle="1" w:styleId="p1">
-    <w:name w:val="p1"/>
-    <w:basedOn w:val="Normal"/>
-    <w:rsid w:val="001958F6"/>
-    <w:pPr>
-      <w:spacing w:after="0"/>
-      <w:ind w:left="411" w:hanging="261"/>
-    </w:pPr>
-    <w:rPr>
-      <w:rFonts w:ascii=".AppleSystemUIFont" w:eastAsiaTheme="minorEastAsia" w:hAnsi=".AppleSystemUIFont" w:cs="Times New Roman"/>
-      <w:color w:val="1B1C1D"/>
-      <w:kern w:val="0"/>
-      <w:sz w:val="24"/>
-      <w14:ligatures w14:val="none"/>
-    </w:rPr>
-  </w:style>
-  <w:style w:type="paragraph" w:customStyle="1" w:styleId="p2">
-    <w:name w:val="p2"/>
-    <w:basedOn w:val="Normal"/>
-    <w:rsid w:val="001958F6"/>
-    <w:pPr>
-      <w:spacing w:before="135" w:after="0"/>
-      <w:ind w:left="411" w:hanging="261"/>
-    </w:pPr>
-    <w:rPr>
-      <w:rFonts w:ascii=".AppleSystemUIFont" w:eastAsiaTheme="minorEastAsia" w:hAnsi=".AppleSystemUIFont" w:cs="Times New Roman"/>
-      <w:color w:val="1B1C1D"/>
-      <w:kern w:val="0"/>
-      <w:sz w:val="24"/>
-      <w14:ligatures w14:val="none"/>
-    </w:rPr>
-  </w:style>
-  <w:style w:type="character" w:customStyle="1" w:styleId="s1">
-    <w:name w:val="s1"/>
-    <w:basedOn w:val="DefaultParagraphFont"/>
-    <w:rsid w:val="001958F6"/>
-    <w:rPr>
-      <w:rFonts w:ascii=".SFUI-Regular" w:hAnsi=".SFUI-Regular" w:hint="default"/>
-      <w:b w:val="0"/>
-      <w:bCs w:val="0"/>
-      <w:i w:val="0"/>
-      <w:iCs w:val="0"/>
-      <w:sz w:val="24"/>
-      <w:szCs w:val="24"/>
-    </w:rPr>
-  </w:style>
-  <w:style w:type="character" w:customStyle="1" w:styleId="s2">
-    <w:name w:val="s2"/>
-    <w:basedOn w:val="DefaultParagraphFont"/>
-    <w:rsid w:val="001958F6"/>
-    <w:rPr>
-      <w:rFonts w:ascii=".SFUI-Semibold" w:hAnsi=".SFUI-Semibold" w:hint="default"/>
-      <w:b/>
-      <w:bCs/>
-      <w:i w:val="0"/>
-      <w:iCs w:val="0"/>
-      <w:sz w:val="24"/>
-      <w:szCs w:val="24"/>
-    </w:rPr>
-  </w:style>
-  <w:style w:type="paragraph" w:styleId="NoSpacing">
-    <w:name w:val="No Spacing"/>
-    <w:uiPriority w:val="1"/>
-    <w:qFormat/>
-    <w:rsid w:val="00DD7C17"/>
-    <w:pPr>
-      <w:spacing w:after="0" w:line="240" w:lineRule="auto"/>
-    </w:pPr>
-    <w:rPr>
-      <w:sz w:val="20"/>
     </w:rPr>
   </w:style>
 </w:styles>
@@ -3618,7 +2523,7 @@
         <a:latin typeface="Aptos" panose="02110004020202020204"/>
         <a:ea typeface=""/>
         <a:cs typeface=""/>
-        <a:font script="Jpan" typeface="游ゴシック"/>
+        <a:font script="Jpan" typeface="游明朝"/>
         <a:font script="Hang" typeface="맑은 고딕"/>
         <a:font script="Hans" typeface="等线"/>
         <a:font script="Hant" typeface="新細明體"/>
@@ -3726,13 +2631,6 @@
         </a:gradFill>
       </a:fillStyleLst>
       <a:lnStyleLst>
-        <a:ln w="6350" cap="flat" cmpd="sng" algn="ctr">
-          <a:solidFill>
-            <a:schemeClr val="phClr"/>
-          </a:solidFill>
-          <a:prstDash val="solid"/>
-          <a:miter lim="800000"/>
-        </a:ln>
         <a:ln w="12700" cap="flat" cmpd="sng" algn="ctr">
           <a:solidFill>
             <a:schemeClr val="phClr"/>
@@ -3741,6 +2639,13 @@
           <a:miter lim="800000"/>
         </a:ln>
         <a:ln w="19050" cap="flat" cmpd="sng" algn="ctr">
+          <a:solidFill>
+            <a:schemeClr val="phClr"/>
+          </a:solidFill>
+          <a:prstDash val="solid"/>
+          <a:miter lim="800000"/>
+        </a:ln>
+        <a:ln w="25400" cap="flat" cmpd="sng" algn="ctr">
           <a:solidFill>
             <a:schemeClr val="phClr"/>
           </a:solidFill>
@@ -3805,11 +2710,31 @@
       </a:bgFillStyleLst>
     </a:fmtScheme>
   </a:themeElements>
-  <a:objectDefaults/>
+  <a:objectDefaults>
+    <a:lnDef>
+      <a:spPr/>
+      <a:bodyPr/>
+      <a:lstStyle/>
+      <a:style>
+        <a:lnRef idx="2">
+          <a:schemeClr val="accent1"/>
+        </a:lnRef>
+        <a:fillRef idx="0">
+          <a:schemeClr val="accent1"/>
+        </a:fillRef>
+        <a:effectRef idx="1">
+          <a:schemeClr val="accent1"/>
+        </a:effectRef>
+        <a:fontRef idx="minor">
+          <a:schemeClr val="tx1"/>
+        </a:fontRef>
+      </a:style>
+    </a:lnDef>
+  </a:objectDefaults>
   <a:extraClrSchemeLst/>
   <a:extLst>
     <a:ext uri="{05A4C25C-085E-4340-85A3-A5531E510DB2}">
-      <thm15:themeFamily xmlns:thm15="http://schemas.microsoft.com/office/thememl/2012/main" name="Office Theme" id="{62F939B6-93AF-4DB8-9C6B-D6C7DFDC589F}" vid="{4A3C46E8-61CC-4603-A589-7422A47A8E4A}"/>
+      <thm15:themeFamily xmlns:thm15="http://schemas.microsoft.com/office/thememl/2012/main" name="Office Theme" id="{2E142A2C-CD16-42D6-873A-C26D2A0506FA}" vid="{1BDDFF52-6CD6-40A5-AB3C-68EB2F1E4D0A}"/>
     </a:ext>
   </a:extLst>
 </a:theme>

</xml_diff>

<commit_message>
Ideas for the Books
</commit_message>
<xml_diff>
--- a/portfolio/documents/resume/mragsdale-resume.docx
+++ b/portfolio/documents/resume/mragsdale-resume.docx
@@ -12,19 +12,13 @@
     </w:p>
     <w:p>
       <w:r>
-        <w:t>Systems Architect | Enterprise Data Engineer Norfolk,</w:t>
-      </w:r>
-      <w:r>
-        <w:t xml:space="preserve"> VA (Willing to Relocate)</w:t>
+        <w:t>Systems Architect | Enterprise Data Engineer Norfolk, VA (Willing to Relocate) | U.S. Citizen (Clearance Eligible) | 757-289-1609</w:t>
       </w:r>
       <w:r>
         <w:t xml:space="preserve"> </w:t>
       </w:r>
       <w:r>
         <w:t xml:space="preserve">| </w:t>
-      </w:r>
-      <w:r>
-        <w:t xml:space="preserve">757-289-1609 | </w:t>
       </w:r>
       <w:hyperlink r:id="rId5" w:history="1">
         <w:r>
@@ -56,8 +50,16 @@
           <w:rPr>
             <w:rStyle w:val="Hyperlink"/>
           </w:rPr>
-          <w:t>github.com/raggiesoft</w:t>
+          <w:t>github.com/</w:t>
         </w:r>
+        <w:proofErr w:type="spellStart"/>
+        <w:r>
+          <w:rPr>
+            <w:rStyle w:val="Hyperlink"/>
+          </w:rPr>
+          <w:t>raggiesoft</w:t>
+        </w:r>
+        <w:proofErr w:type="spellEnd"/>
       </w:hyperlink>
     </w:p>
     <w:p>
@@ -70,7 +72,21 @@
     </w:p>
     <w:p>
       <w:r>
-        <w:t>Systems Architect and Data Engineering Leader driven by a philosophy of "Empathetic Engineering"—the conviction that resilient data platforms must respect both the server's infrastructure and the end user’s cognitive load. Proven track record operating as a technical "player-coach," designing complex ETL pipelines, bridging legacy databases with modern cloud environments, and establishing strict enterprise compliance frameworks. Specialist in leveraging open-source MVC architecture, secure cloud deployments, and production-grade AI/LLM integrations to drive institutional data strategies and accessible, zero-latency digital ecosystems.</w:t>
+        <w:t xml:space="preserve">Systems Architect and Data Engineering Leader driven by a philosophy of "Empathetic </w:t>
+      </w:r>
+      <w:proofErr w:type="gramStart"/>
+      <w:r>
+        <w:t>Engineering"—</w:t>
+      </w:r>
+      <w:proofErr w:type="gramEnd"/>
+      <w:r>
+        <w:t xml:space="preserve">the conviction that resilient data platforms must respect both the server's infrastructure and the end user’s cognitive load. </w:t>
+      </w:r>
+      <w:r>
+        <w:t>Proven track record operating as a technical "player-coach," designing complex ETL pipelines, bridging legacy databases with modern cloud environments, and establishing strict enterprise compliance frameworks. U.S. Citizen exceptionally positioned for rapid DoD clearance adjudication, supported by a pristine background history and prior federal Public Trust.</w:t>
+      </w:r>
+      <w:r>
+        <w:t xml:space="preserve"> Specialist in leveraging open-source MVC architecture, secure cloud deployments, and production-grade AI/LLM integrations to drive institutional data strategies and accessible, zero-latency digital ecosystems.</w:t>
       </w:r>
     </w:p>
     <w:p>
@@ -132,7 +148,15 @@
         <w:t>Infrastructure &amp; Cloud:</w:t>
       </w:r>
       <w:r>
-        <w:t xml:space="preserve"> DigitalOcean (Droplets/Spaces), Nginx, Cloudflare Zero Trust (DNS/SSL), Decoupled CI/CD Pipelines</w:t>
+        <w:t xml:space="preserve"> </w:t>
+      </w:r>
+      <w:proofErr w:type="spellStart"/>
+      <w:r>
+        <w:t>DigitalOcean</w:t>
+      </w:r>
+      <w:proofErr w:type="spellEnd"/>
+      <w:r>
+        <w:t xml:space="preserve"> (Droplets/Spaces), Nginx, Cloudflare Zero Trust (DNS/SSL), Decoupled CI/CD Pipelines</w:t>
       </w:r>
     </w:p>
     <w:p>
@@ -150,7 +174,15 @@
         <w:t>Compliance &amp; Enterprise Governance:</w:t>
       </w:r>
       <w:r>
-        <w:t xml:space="preserve"> Strict WCAG 2.1 AA, Section 508, ActiveNet CRM, JSON-LD / Schema.org, Deque axe</w:t>
+        <w:t xml:space="preserve"> Strict WCAG 2.1 AA, Section 508, </w:t>
+      </w:r>
+      <w:proofErr w:type="spellStart"/>
+      <w:r>
+        <w:t>ActiveNet</w:t>
+      </w:r>
+      <w:proofErr w:type="spellEnd"/>
+      <w:r>
+        <w:t xml:space="preserve"> CRM, JSON-LD / Schema.org, Deque axe</w:t>
       </w:r>
     </w:p>
     <w:p>
@@ -158,6 +190,7 @@
         <w:pStyle w:val="Heading1"/>
       </w:pPr>
       <w:r>
+        <w:lastRenderedPageBreak/>
         <w:t>RELEVANT TECHNICAL EXPERIENCE</w:t>
       </w:r>
     </w:p>
@@ -173,7 +206,15 @@
         <w:t>Principal Systems Architect (Open Source)</w:t>
       </w:r>
       <w:r>
-        <w:t xml:space="preserve"> RaggieSoft Media | Norfolk, VA | Est. 2008 – Present</w:t>
+        <w:t xml:space="preserve"> </w:t>
+      </w:r>
+      <w:proofErr w:type="spellStart"/>
+      <w:r>
+        <w:t>RaggieSoft</w:t>
+      </w:r>
+      <w:proofErr w:type="spellEnd"/>
+      <w:r>
+        <w:t xml:space="preserve"> Media | Norfolk, VA | Est. 2008 – Present</w:t>
       </w:r>
     </w:p>
     <w:p>
@@ -206,7 +247,6 @@
           <w:b/>
           <w:bCs/>
         </w:rPr>
-        <w:lastRenderedPageBreak/>
         <w:t>AI &amp; LLM Integration:</w:t>
       </w:r>
       <w:r>
@@ -228,7 +268,15 @@
         <w:t>DevOps &amp; Cloud Leadership:</w:t>
       </w:r>
       <w:r>
-        <w:t xml:space="preserve"> Directed a strategic infrastructure migration to high-performance DigitalOcean environments, utilizing Cloudflare edge networking, custom Nginx proxies, and decoupled Bash CI/CD pipelines (Jenna and Sarah) for automated, zero-downtime server synchronization.</w:t>
+        <w:t xml:space="preserve"> Directed a strategic infrastructure migration to high-performance </w:t>
+      </w:r>
+      <w:proofErr w:type="spellStart"/>
+      <w:r>
+        <w:t>DigitalOcean</w:t>
+      </w:r>
+      <w:proofErr w:type="spellEnd"/>
+      <w:r>
+        <w:t xml:space="preserve"> environments, utilizing Cloudflare edge networking, custom Nginx proxies, and decoupled Bash CI/CD pipelines (Jenna and Sarah) for automated, zero-downtime server synchronization.</w:t>
       </w:r>
     </w:p>
     <w:p>
@@ -286,7 +334,15 @@
         <w:t>Data Engineering &amp; ETL Pipelines:</w:t>
       </w:r>
       <w:r>
-        <w:t xml:space="preserve"> Architect and manage manual ETL (Extract-Transform-Load) pipelines to ingest, normalize, and secure complex operational and financial data from legacy enterprise platforms (ActiveNet) into highly accessible digital formats.</w:t>
+        <w:t xml:space="preserve"> Architect and manage manual ETL (Extract-Transform-Load) pipelines to ingest, normalize, and secure complex operational and financial data from legacy enterprise platforms (</w:t>
+      </w:r>
+      <w:proofErr w:type="spellStart"/>
+      <w:r>
+        <w:t>ActiveNet</w:t>
+      </w:r>
+      <w:proofErr w:type="spellEnd"/>
+      <w:r>
+        <w:t>) into highly accessible digital formats.</w:t>
       </w:r>
     </w:p>
     <w:p>
@@ -337,6 +393,7 @@
           <w:b/>
           <w:bCs/>
         </w:rPr>
+        <w:lastRenderedPageBreak/>
         <w:t>Compliance Enforcement:</w:t>
       </w:r>
       <w:r>
@@ -352,7 +409,6 @@
           <w:b/>
           <w:bCs/>
         </w:rPr>
-        <w:lastRenderedPageBreak/>
         <w:t>Computer Operations Technician (Functional Accessibility Specialist)</w:t>
       </w:r>
       <w:r>
@@ -436,7 +492,15 @@
         </w:numPr>
       </w:pPr>
       <w:r>
-        <w:t>Engineered cross-platform mobile applications for iOS and Android utilizing the JavaScript-based Titanium SDK.</w:t>
+        <w:t xml:space="preserve">Engineered cross-platform mobile applications for iOS and Android utilizing </w:t>
+      </w:r>
+      <w:proofErr w:type="gramStart"/>
+      <w:r>
+        <w:t>the JavaScript</w:t>
+      </w:r>
+      <w:proofErr w:type="gramEnd"/>
+      <w:r>
+        <w:t>-based Titanium SDK.</w:t>
       </w:r>
     </w:p>
     <w:p>
@@ -515,7 +579,6 @@
         <w:t xml:space="preserve"> | Fishersville, VA Certificate, Business &amp; Information Technology | 2011</w:t>
       </w:r>
     </w:p>
-    <w:p/>
     <w:sectPr>
       <w:pgSz w:w="12240" w:h="15840"/>
       <w:pgMar w:top="1440" w:right="1440" w:bottom="1440" w:left="1440" w:header="720" w:footer="720" w:gutter="0"/>
@@ -2045,7 +2108,6 @@
   <w:style w:type="character" w:default="1" w:styleId="DefaultParagraphFont">
     <w:name w:val="Default Paragraph Font"/>
     <w:uiPriority w:val="1"/>
-    <w:semiHidden/>
     <w:unhideWhenUsed/>
   </w:style>
   <w:style w:type="table" w:default="1" w:styleId="TableNormal">

</xml_diff>